<commit_message>
docs: fill in the questoins
</commit_message>
<xml_diff>
--- a/51IP Injenerija prykladnyh zastosunkiv/1/IP_KNT-122_Onyshchenko_19_PR1.docx
+++ b/51IP Injenerija prykladnyh zastosunkiv/1/IP_KNT-122_Onyshchenko_19_PR1.docx
@@ -727,6 +727,75 @@
     </w:p>
     <w:p>
       <w:pPr>
+        <w:pStyle w:val="P1"/>
+        <w:spacing w:before="0" w:after="0"/>
+        <w:rPr/>
+      </w:pPr>
+      <w:r>
+        <w:rPr/>
+      </w:r>
+    </w:p>
+    <w:p>
+      <w:pPr>
+        <w:pStyle w:val="P1"/>
+        <w:spacing w:before="0" w:after="0"/>
+        <w:rPr/>
+      </w:pPr>
+      <w:r>
+        <w:rPr/>
+        <w:t xml:space="preserve">Часовий ряд є послідовністю точок даних, проіндексованих у хронологічному порядку. </w:t>
+      </w:r>
+    </w:p>
+    <w:p>
+      <w:pPr>
+        <w:pStyle w:val="P1"/>
+        <w:spacing w:before="0" w:after="0"/>
+        <w:rPr/>
+      </w:pPr>
+      <w:r>
+        <w:fldChar w:fldCharType="begin"/>
+      </w:r>
+      <w:r>
+        <w:rPr>
+          <w:rStyle w:val="Hyperlink"/>
+        </w:rPr>
+        <w:instrText xml:space="preserve"> HYPERLINK "https://sharpskill.dev/uk/technologies/data-science/pytannia-spivbesidy/time-series-forecasting" \l ":~:text=%D0%A7%D0%B0%D1%81%D0%BE%D0%B2%D0%B8%D0%B9%20%D1%80%D1%8F%D0%B4%20%E2%80%94%20%D1%86%D0%B5%20%D0%BF%D0%BE%D1%81%D0%BB%D1%96%D0%B4%D0%BE%D0%B2%D0%BD%D1%96%D1%81%D1%82%D1%8C%20%D1%82%D0%BE%D1%87%D0%BE%D0%BA%20%D0%B4%D0%B0%D0%BD%D0%B8%D1%85%2C%20%D0%BF%D1%80%D0%BE%D1%96%D0%BD%D0%B4%D0%B5%D0%BA%D1%81%D0%BE%D0%B2%D0%B0%D0%BD%D0%B8%D1%85%20%D1%83%20%D1%85%D1%80%D0%BE%D0%BD%D0%BE%D0%BB%D0%BE%D0%B3%D1%96%D1%87%D0%BD%D0%BE%D0%BC%D1%83%20%D0%BF%D0%BE%D1%80%D1%8F%D0%B4%D0%BA%D1%83.%20%D0%A1%D0%BF%D0%BE%D1%81%D1%82%D0%B5%D1%80%D0%B5%D0%B6%D0%B5%D0%BD%D0%BD%D1%8F%20%D0%B7%D0%B1%D0%B8%D1%80%D0%B0%D1%8E%D1%82%D1%8C%D1%81%D1%8F%20%D1%87%D0%B5%D1%80%D0%B5%D0%B7%20%D1%80%D0%B5%D0%B3%D1%83%D0%BB%D1%8F%D1%80%D0%BD%D1%96%20%D1%96%D0%BD%D1%82%D0%B5%D1%80%D0%B2%D0%B0%D0%BB%D0%B8%20(%D0%BF%D0%BE%D0%B3%D0%BE%D0%B4%D0%B8%D0%BD%D0%BD%D0%BE%2C%20%D1%89%D0%BE%D0%B4%D0%BD%D1%8F%2C%20%D1%89%D0%BE%D0%BC%D1%96%D1%81%D1%8F%D1%86%D1%8F)%20%D1%96%20%D1%87%D0%B0%D1%81%D1%82%D0%BE%20%D0%B4%D0%B5%D0%BC%D0%BE%D0%BD%D1%81%D1%82%D1%80%D1%83%D1%8E%D1%82%D1%8C%20%D1%87%D0%B0%D1%81%D0%BE%D0%B2%D1%96%20%D0%B7%D0%B0%D0%BB%D0%B5%D0%B6%D0%BD%D0%BE%D1%81%D1%82%D1%96.%20%D0%9A%D0%BB%D0%B0%D1%81%D0%B8%D1%87%D0%BD%D1%96%20%D0%BF%D1%80%D0%B8%D0%BA%D0%BB%D0%B0%D0%B4%D0%B8%3A%20%D1%86%D1%96%D0%BD%D0%B8%20%D0%B0%D0%BA%D1%86%D1%96%D0%B9%2C%20%D1%82%D0%B5%D0%BC%D0%BF%D0%B5%D1%80%D0%B0%D1%82%D1%83%D1%80%D0%B8%2C%20%D0%BC%D1%96%D1%81%D1%8F%D1%87%D0%BD%D1%96%20%D0%BF%D1%80%D0%BE%D0%B4%D0%B0%D0%B6%D1%96."</w:instrText>
+      </w:r>
+      <w:r>
+        <w:rPr>
+          <w:rStyle w:val="Hyperlink"/>
+        </w:rPr>
+        <w:fldChar w:fldCharType="separate"/>
+      </w:r>
+      <w:r>
+        <w:rPr>
+          <w:rStyle w:val="Hyperlink"/>
+        </w:rPr>
+        <w:t>Джерело</w:t>
+      </w:r>
+      <w:r>
+        <w:rPr>
+          <w:rStyle w:val="Hyperlink"/>
+        </w:rPr>
+        <w:fldChar w:fldCharType="end"/>
+      </w:r>
+      <w:r>
+        <w:rPr/>
+        <w:t>.</w:t>
+      </w:r>
+    </w:p>
+    <w:p>
+      <w:pPr>
+        <w:pStyle w:val="P1"/>
+        <w:spacing w:before="0" w:after="0"/>
+        <w:rPr/>
+      </w:pPr>
+      <w:r>
+        <w:rPr/>
+      </w:r>
+    </w:p>
+    <w:p>
+      <w:pPr>
         <w:pStyle w:val="H2"/>
         <w:rPr/>
       </w:pPr>
@@ -737,12 +806,119 @@
     </w:p>
     <w:p>
       <w:pPr>
+        <w:pStyle w:val="P1"/>
+        <w:rPr/>
+      </w:pPr>
+      <w:r>
+        <w:rPr/>
+      </w:r>
+    </w:p>
+    <w:p>
+      <w:pPr>
+        <w:pStyle w:val="P1"/>
+        <w:rPr/>
+      </w:pPr>
+      <w:r>
+        <w:rPr/>
+        <w:t>Прикладами даних, поданих у вигляді часового рядку можуть бути:</w:t>
+      </w:r>
+    </w:p>
+    <w:p>
+      <w:pPr>
+        <w:pStyle w:val="P1"/>
+        <w:rPr/>
+      </w:pPr>
+      <w:r>
+        <w:rPr/>
+        <w:t>- кардіограма;</w:t>
+      </w:r>
+    </w:p>
+    <w:p>
+      <w:pPr>
+        <w:pStyle w:val="P1"/>
+        <w:rPr/>
+      </w:pPr>
+      <w:r>
+        <w:rPr/>
+        <w:t>- швидкість машини під час поїздки;</w:t>
+      </w:r>
+    </w:p>
+    <w:p>
+      <w:pPr>
+        <w:pStyle w:val="P1"/>
+        <w:rPr/>
+      </w:pPr>
+      <w:r>
+        <w:rPr/>
+        <w:t>- висота літака в різні моменти польоту.</w:t>
+      </w:r>
+    </w:p>
+    <w:p>
+      <w:pPr>
+        <w:pStyle w:val="P1"/>
+        <w:rPr/>
+      </w:pPr>
+      <w:r>
+        <w:rPr/>
+      </w:r>
+    </w:p>
+    <w:p>
+      <w:pPr>
         <w:pStyle w:val="H2"/>
         <w:rPr/>
       </w:pPr>
       <w:r>
         <w:rPr/>
         <w:t>У яких прикладних областях використовуються часові ряди?</w:t>
+      </w:r>
+    </w:p>
+    <w:p>
+      <w:pPr>
+        <w:pStyle w:val="P1"/>
+        <w:rPr/>
+      </w:pPr>
+      <w:r>
+        <w:rPr/>
+      </w:r>
+    </w:p>
+    <w:p>
+      <w:pPr>
+        <w:pStyle w:val="P1"/>
+        <w:rPr/>
+      </w:pPr>
+      <w:r>
+        <w:rPr/>
+        <w:t>Часові ряди можуть використовуватися в таких областях:</w:t>
+      </w:r>
+    </w:p>
+    <w:p>
+      <w:pPr>
+        <w:pStyle w:val="P1"/>
+        <w:rPr/>
+      </w:pPr>
+      <w:r>
+        <w:rPr/>
+        <w:t>- авіація;</w:t>
+      </w:r>
+    </w:p>
+    <w:p>
+      <w:pPr>
+        <w:pStyle w:val="P1"/>
+        <w:rPr/>
+      </w:pPr>
+      <w:r>
+        <w:rPr/>
+        <w:t>- автоспорт;</w:t>
+      </w:r>
+    </w:p>
+    <w:p>
+      <w:pPr>
+        <w:pStyle w:val="P1"/>
+        <w:rPr/>
+      </w:pPr>
+      <w:r>
+        <w:rPr/>
+        <w:t>- медицина.</w:t>
       </w:r>
     </w:p>
     <w:sectPr>
@@ -1548,6 +1724,13 @@
     <w:qFormat/>
     <w:rPr/>
   </w:style>
+  <w:style w:type="character" w:styleId="FollowedHyperlink">
+    <w:name w:val="FollowedHyperlink"/>
+    <w:rPr>
+      <w:color w:val="800000"/>
+      <w:u w:val="single"/>
+    </w:rPr>
+  </w:style>
   <w:style w:type="paragraph" w:styleId="Style12">
     <w:name w:val="Заголовок"/>
     <w:basedOn w:val="Normal"/>

</xml_diff>

<commit_message>
feat: calculate MSE manually
</commit_message>
<xml_diff>
--- a/51IP Injenerija prykladnyh zastosunkiv/1/IP_KNT-122_Onyshchenko_19_PR1.docx
+++ b/51IP Injenerija prykladnyh zastosunkiv/1/IP_KNT-122_Onyshchenko_19_PR1.docx
@@ -416,6 +416,37 @@
     </w:p>
     <w:p>
       <w:pPr>
+        <w:pStyle w:val="p11"/>
+        <w:spacing w:before="0" w:after="0"/>
+        <w:rPr/>
+      </w:pPr>
+      <w:r>
+        <w:rPr/>
+      </w:r>
+    </w:p>
+    <w:p>
+      <w:pPr>
+        <w:pStyle w:val="p11"/>
+        <w:spacing w:before="0" w:after="0"/>
+        <w:rPr/>
+      </w:pPr>
+      <w:r>
+        <w:rPr/>
+        <w:t>Навчитися реалізовувати програмні проєкти у сфері інженерії програмного забезпечення, пов’язані з необхідністю обробки часових послідовностей даних.</w:t>
+      </w:r>
+    </w:p>
+    <w:p>
+      <w:pPr>
+        <w:pStyle w:val="p11"/>
+        <w:spacing w:before="0" w:after="0"/>
+        <w:rPr/>
+      </w:pPr>
+      <w:r>
+        <w:rPr/>
+      </w:r>
+    </w:p>
+    <w:p>
+      <w:pPr>
         <w:pStyle w:val="h11"/>
         <w:rPr/>
       </w:pPr>
@@ -702,6 +733,34 @@
       <w:r>
         <w:rPr/>
         <w:t>Висновки</w:t>
+      </w:r>
+    </w:p>
+    <w:p>
+      <w:pPr>
+        <w:pStyle w:val="p11"/>
+        <w:rPr/>
+      </w:pPr>
+      <w:r>
+        <w:rPr/>
+      </w:r>
+    </w:p>
+    <w:p>
+      <w:pPr>
+        <w:pStyle w:val="p11"/>
+        <w:rPr/>
+      </w:pPr>
+      <w:r>
+        <w:rPr/>
+        <w:t>Отже, було навчено реалізовувати програмні проєкти у сфері інженерії програмного забезпечення, пов’язані з необхідністю обробки часових послідовностей даних.</w:t>
+      </w:r>
+    </w:p>
+    <w:p>
+      <w:pPr>
+        <w:pStyle w:val="p11"/>
+        <w:rPr/>
+      </w:pPr>
+      <w:r>
+        <w:rPr/>
       </w:r>
     </w:p>
     <w:p>

</xml_diff>

<commit_message>
chore: doing the first IP lab
</commit_message>
<xml_diff>
--- a/51IP Injenerija prykladnyh zastosunkiv/1/IP_KNT-122_Onyshchenko_19_PR1.docx
+++ b/51IP Injenerija prykladnyh zastosunkiv/1/IP_KNT-122_Onyshchenko_19_PR1.docx
@@ -151,7 +151,15 @@
       </w:pPr>
       <w:r>
         <w:rPr/>
-        <w:t>Тема «»</w:t>
+        <w:t>Тема «</w:t>
+      </w:r>
+      <w:r>
+        <w:rPr/>
+        <w:t>Програмне забезпечення обробки часових рядів</w:t>
+      </w:r>
+      <w:r>
+        <w:rPr/>
+        <w:t>»</w:t>
       </w:r>
     </w:p>
     <w:p>
@@ -374,14 +382,16 @@
           <w:tab w:val="center" w:pos="4961" w:leader="none"/>
         </w:tabs>
         <w:ind w:hanging="0"/>
-        <w:rPr/>
-      </w:pPr>
-      <w:r>
-        <w:rPr/>
-        <w:tab/>
-        <w:tab/>
-        <w:tab/>
-        <w:t>2025</w:t>
+        <w:jc w:val="center"/>
+        <w:rPr/>
+      </w:pPr>
+      <w:r>
+        <w:rPr/>
+        <w:t>202</w:t>
+      </w:r>
+      <w:r>
+        <w:rPr/>
+        <w:t>6</w:t>
       </w:r>
     </w:p>
     <w:p>
@@ -605,15 +615,7 @@
       </w:pPr>
       <w:r>
         <w:rPr/>
-        <w:t>Студент не обмежується у виборі мови програмування та інших засоб</w:t>
-      </w:r>
-      <w:r>
-        <w:rPr/>
-        <w:t>ів</w:t>
-      </w:r>
-      <w:r>
-        <w:rPr/>
-        <w:t xml:space="preserve"> розробки програмного забезпечення. </w:t>
+        <w:t xml:space="preserve">Студент не обмежується у виборі мови програмування та інших засобів розробки програмного забезпечення. </w:t>
       </w:r>
     </w:p>
     <w:p>
@@ -703,6 +705,34 @@
       <w:r>
         <w:rPr/>
         <w:t>Вхідні дані</w:t>
+      </w:r>
+    </w:p>
+    <w:p>
+      <w:pPr>
+        <w:pStyle w:val="p11"/>
+        <w:rPr/>
+      </w:pPr>
+      <w:r>
+        <w:rPr/>
+      </w:r>
+    </w:p>
+    <w:p>
+      <w:pPr>
+        <w:pStyle w:val="p11"/>
+        <w:rPr/>
+      </w:pPr>
+      <w:r>
+        <w:rPr/>
+        <w:t>Формат та короткий опис.</w:t>
+      </w:r>
+    </w:p>
+    <w:p>
+      <w:pPr>
+        <w:pStyle w:val="p11"/>
+        <w:rPr/>
+      </w:pPr>
+      <w:r>
+        <w:rPr/>
       </w:r>
     </w:p>
     <w:p>
@@ -1778,8 +1808,8 @@
       <w:lang w:val="en-US" w:eastAsia="uk-UA"/>
     </w:rPr>
   </w:style>
-  <w:style w:type="character" w:styleId="user">
-    <w:name w:val="Символ нумерації (user)"/>
+  <w:style w:type="character" w:styleId="Style12">
+    <w:name w:val="Символ нумерації"/>
     <w:qFormat/>
     <w:rPr/>
   </w:style>
@@ -1790,7 +1820,7 @@
       <w:u w:val="single"/>
     </w:rPr>
   </w:style>
-  <w:style w:type="paragraph" w:styleId="Style12">
+  <w:style w:type="paragraph" w:styleId="Style13">
     <w:name w:val="Заголовок"/>
     <w:basedOn w:val="Normal"/>
     <w:next w:val="BodyText"/>
@@ -1800,7 +1830,7 @@
       <w:spacing w:before="240" w:after="120"/>
     </w:pPr>
     <w:rPr>
-      <w:rFonts w:ascii="Liberation Sans" w:hAnsi="Liberation Sans" w:eastAsia="Microsoft YaHei" w:cs="Arial Unicode MS"/>
+      <w:rFonts w:ascii="Liberation Sans" w:hAnsi="Liberation Sans" w:eastAsia="Microsoft YaHei" w:cs="Lucida Sans"/>
       <w:sz w:val="28"/>
       <w:szCs w:val="28"/>
     </w:rPr>
@@ -1837,7 +1867,7 @@
       <w:szCs w:val="24"/>
     </w:rPr>
   </w:style>
-  <w:style w:type="paragraph" w:styleId="Style13">
+  <w:style w:type="paragraph" w:styleId="Style14">
     <w:name w:val="Покажчик"/>
     <w:basedOn w:val="Normal"/>
     <w:qFormat/>
@@ -1845,10 +1875,10 @@
       <w:suppressLineNumbers/>
     </w:pPr>
     <w:rPr>
-      <w:rFonts w:cs="Arial Unicode MS"/>
-    </w:rPr>
-  </w:style>
-  <w:style w:type="paragraph" w:styleId="user1">
+      <w:rFonts w:cs="Lucida Sans"/>
+    </w:rPr>
+  </w:style>
+  <w:style w:type="paragraph" w:styleId="user">
     <w:name w:val="Заголовок (user)"/>
     <w:basedOn w:val="Normal"/>
     <w:next w:val="BodyText"/>
@@ -1858,12 +1888,12 @@
       <w:spacing w:before="240" w:after="120"/>
     </w:pPr>
     <w:rPr>
-      <w:rFonts w:ascii="Liberation Sans" w:hAnsi="Liberation Sans" w:eastAsia="Microsoft YaHei" w:cs="Lucida Sans"/>
+      <w:rFonts w:ascii="Liberation Sans" w:hAnsi="Liberation Sans" w:eastAsia="Microsoft YaHei" w:cs="Arial Unicode MS"/>
       <w:sz w:val="28"/>
       <w:szCs w:val="28"/>
     </w:rPr>
   </w:style>
-  <w:style w:type="paragraph" w:styleId="user2">
+  <w:style w:type="paragraph" w:styleId="user1">
     <w:name w:val="Покажчик (user)"/>
     <w:basedOn w:val="Normal"/>
     <w:qFormat/>
@@ -1871,12 +1901,12 @@
       <w:suppressLineNumbers/>
     </w:pPr>
     <w:rPr>
-      <w:rFonts w:cs="Lucida Sans"/>
+      <w:rFonts w:cs="Arial Unicode MS"/>
     </w:rPr>
   </w:style>
   <w:style w:type="paragraph" w:styleId="IndexHeading">
     <w:name w:val="index heading"/>
-    <w:basedOn w:val="Style12"/>
+    <w:basedOn w:val="user"/>
     <w:pPr/>
     <w:rPr/>
   </w:style>
@@ -2151,8 +2181,8 @@
     </w:pPr>
     <w:rPr/>
   </w:style>
-  <w:style w:type="numbering" w:styleId="Style14" w:default="1">
-    <w:name w:val="Без маркерів"/>
+  <w:style w:type="numbering" w:styleId="user2" w:default="1">
+    <w:name w:val="Без маркерів (user)"/>
     <w:uiPriority w:val="99"/>
     <w:semiHidden/>
     <w:unhideWhenUsed/>

</xml_diff>

<commit_message>
feat: load the data
</commit_message>
<xml_diff>
--- a/51IP Injenerija prykladnyh zastosunkiv/1/IP_KNT-122_Onyshchenko_19_PR1.docx
+++ b/51IP Injenerija prykladnyh zastosunkiv/1/IP_KNT-122_Onyshchenko_19_PR1.docx
@@ -151,15 +151,7 @@
       </w:pPr>
       <w:r>
         <w:rPr/>
-        <w:t>Тема «</w:t>
-      </w:r>
-      <w:r>
-        <w:rPr/>
-        <w:t>Програмне забезпечення обробки часових рядів</w:t>
-      </w:r>
-      <w:r>
-        <w:rPr/>
-        <w:t>»</w:t>
+        <w:t>Тема «Програмне забезпечення обробки часових рядів»</w:t>
       </w:r>
     </w:p>
     <w:p>
@@ -387,11 +379,7 @@
       </w:pPr>
       <w:r>
         <w:rPr/>
-        <w:t>202</w:t>
-      </w:r>
-      <w:r>
-        <w:rPr/>
-        <w:t>6</w:t>
+        <w:t>2026</w:t>
       </w:r>
     </w:p>
     <w:p>
@@ -1808,8 +1796,8 @@
       <w:lang w:val="en-US" w:eastAsia="uk-UA"/>
     </w:rPr>
   </w:style>
-  <w:style w:type="character" w:styleId="Style12">
-    <w:name w:val="Символ нумерації"/>
+  <w:style w:type="character" w:styleId="user">
+    <w:name w:val="Символ нумерації (user)"/>
     <w:qFormat/>
     <w:rPr/>
   </w:style>
@@ -1820,7 +1808,7 @@
       <w:u w:val="single"/>
     </w:rPr>
   </w:style>
-  <w:style w:type="paragraph" w:styleId="Style13">
+  <w:style w:type="paragraph" w:styleId="Style12">
     <w:name w:val="Заголовок"/>
     <w:basedOn w:val="Normal"/>
     <w:next w:val="BodyText"/>
@@ -1830,7 +1818,7 @@
       <w:spacing w:before="240" w:after="120"/>
     </w:pPr>
     <w:rPr>
-      <w:rFonts w:ascii="Liberation Sans" w:hAnsi="Liberation Sans" w:eastAsia="Microsoft YaHei" w:cs="Lucida Sans"/>
+      <w:rFonts w:ascii="Liberation Sans" w:hAnsi="Liberation Sans" w:eastAsia="Microsoft YaHei" w:cs="Arial Unicode MS"/>
       <w:sz w:val="28"/>
       <w:szCs w:val="28"/>
     </w:rPr>
@@ -1867,7 +1855,7 @@
       <w:szCs w:val="24"/>
     </w:rPr>
   </w:style>
-  <w:style w:type="paragraph" w:styleId="Style14">
+  <w:style w:type="paragraph" w:styleId="Style13">
     <w:name w:val="Покажчик"/>
     <w:basedOn w:val="Normal"/>
     <w:qFormat/>
@@ -1875,10 +1863,10 @@
       <w:suppressLineNumbers/>
     </w:pPr>
     <w:rPr>
-      <w:rFonts w:cs="Lucida Sans"/>
-    </w:rPr>
-  </w:style>
-  <w:style w:type="paragraph" w:styleId="user">
+      <w:rFonts w:cs="Arial Unicode MS"/>
+    </w:rPr>
+  </w:style>
+  <w:style w:type="paragraph" w:styleId="user1">
     <w:name w:val="Заголовок (user)"/>
     <w:basedOn w:val="Normal"/>
     <w:next w:val="BodyText"/>
@@ -1888,12 +1876,12 @@
       <w:spacing w:before="240" w:after="120"/>
     </w:pPr>
     <w:rPr>
-      <w:rFonts w:ascii="Liberation Sans" w:hAnsi="Liberation Sans" w:eastAsia="Microsoft YaHei" w:cs="Arial Unicode MS"/>
+      <w:rFonts w:ascii="Liberation Sans" w:hAnsi="Liberation Sans" w:eastAsia="Microsoft YaHei" w:cs="Lucida Sans"/>
       <w:sz w:val="28"/>
       <w:szCs w:val="28"/>
     </w:rPr>
   </w:style>
-  <w:style w:type="paragraph" w:styleId="user1">
+  <w:style w:type="paragraph" w:styleId="user2">
     <w:name w:val="Покажчик (user)"/>
     <w:basedOn w:val="Normal"/>
     <w:qFormat/>
@@ -1901,12 +1889,12 @@
       <w:suppressLineNumbers/>
     </w:pPr>
     <w:rPr>
-      <w:rFonts w:cs="Arial Unicode MS"/>
+      <w:rFonts w:cs="Lucida Sans"/>
     </w:rPr>
   </w:style>
   <w:style w:type="paragraph" w:styleId="IndexHeading">
     <w:name w:val="index heading"/>
-    <w:basedOn w:val="user"/>
+    <w:basedOn w:val="Style12"/>
     <w:pPr/>
     <w:rPr/>
   </w:style>
@@ -2181,8 +2169,8 @@
     </w:pPr>
     <w:rPr/>
   </w:style>
-  <w:style w:type="numbering" w:styleId="user2" w:default="1">
-    <w:name w:val="Без маркерів (user)"/>
+  <w:style w:type="numbering" w:styleId="Style14" w:default="1">
+    <w:name w:val="Без маркерів"/>
     <w:uiPriority w:val="99"/>
     <w:semiHidden/>
     <w:unhideWhenUsed/>

</xml_diff>

<commit_message>
chore: trying something, not much
</commit_message>
<xml_diff>
--- a/51IP Injenerija prykladnyh zastosunkiv/1/IP_KNT-122_Onyshchenko_19_PR1.docx
+++ b/51IP Injenerija prykladnyh zastosunkiv/1/IP_KNT-122_Onyshchenko_19_PR1.docx
@@ -711,7 +711,123 @@
       </w:pPr>
       <w:r>
         <w:rPr/>
-        <w:t>Формат та короткий опис.</w:t>
+        <w:t xml:space="preserve">Як набір даних було обрано один під назвою </w:t>
+      </w:r>
+      <w:r>
+        <w:rPr>
+          <w:lang w:val="en-US"/>
+        </w:rPr>
+        <w:t xml:space="preserve">Electric_Production.csv. </w:t>
+      </w:r>
+      <w:r>
+        <w:rPr>
+          <w:lang w:val="uk-UA"/>
+        </w:rPr>
+        <w:t xml:space="preserve">Його було взято звідси: </w:t>
+      </w:r>
+      <w:hyperlink r:id="rId3">
+        <w:r>
+          <w:rPr>
+            <w:rStyle w:val="Hyperlink"/>
+          </w:rPr>
+          <w:t>Time Series Datasets</w:t>
+        </w:r>
+      </w:hyperlink>
+      <w:r>
+        <w:rPr/>
+        <w:t>.</w:t>
+      </w:r>
+    </w:p>
+    <w:p>
+      <w:pPr>
+        <w:pStyle w:val="p11"/>
+        <w:rPr/>
+      </w:pPr>
+      <w:r>
+        <w:rPr/>
+        <w:t>Набір даних містить щоденні дані про споживання електроенергії. Місто, з якого взято ці дані, не вказане. Формат даних — C</w:t>
+      </w:r>
+      <w:r>
+        <w:rPr>
+          <w:lang w:val="en-US"/>
+        </w:rPr>
+        <w:t>SV (comma separated values).</w:t>
+      </w:r>
+    </w:p>
+    <w:p>
+      <w:pPr>
+        <w:pStyle w:val="p11"/>
+        <w:rPr/>
+      </w:pPr>
+      <w:r>
+        <w:rPr/>
+        <w:t>Вигляд перших семи рядків нижче на рисунку 0.1.</w:t>
+      </w:r>
+    </w:p>
+    <w:p>
+      <w:pPr>
+        <w:pStyle w:val="p11"/>
+        <w:rPr/>
+      </w:pPr>
+      <w:r>
+        <w:rPr/>
+      </w:r>
+    </w:p>
+    <w:p>
+      <w:pPr>
+        <w:pStyle w:val="img1"/>
+        <w:rPr/>
+      </w:pPr>
+      <w:r>
+        <w:rPr/>
+        <w:drawing>
+          <wp:inline distT="0" distB="0" distL="0" distR="0">
+            <wp:extent cx="2000250" cy="1987550"/>
+            <wp:effectExtent l="0" t="0" r="0" b="0"/>
+            <wp:docPr id="1" name="Зображення1"/>
+            <wp:cNvGraphicFramePr>
+              <a:graphicFrameLocks xmlns:a="http://schemas.openxmlformats.org/drawingml/2006/main" noChangeAspect="1"/>
+            </wp:cNvGraphicFramePr>
+            <a:graphic xmlns:a="http://schemas.openxmlformats.org/drawingml/2006/main">
+              <a:graphicData uri="http://schemas.openxmlformats.org/drawingml/2006/picture">
+                <pic:pic xmlns:pic="http://schemas.openxmlformats.org/drawingml/2006/picture">
+                  <pic:nvPicPr>
+                    <pic:cNvPr id="1" name="Зображення1"/>
+                    <pic:cNvPicPr>
+                      <a:picLocks noChangeAspect="1" noChangeArrowheads="1"/>
+                    </pic:cNvPicPr>
+                  </pic:nvPicPr>
+                  <pic:blipFill>
+                    <a:blip r:embed="rId4"/>
+                    <a:stretch>
+                      <a:fillRect/>
+                    </a:stretch>
+                  </pic:blipFill>
+                  <pic:spPr bwMode="auto">
+                    <a:xfrm>
+                      <a:off x="0" y="0"/>
+                      <a:ext cx="2000250" cy="1987550"/>
+                    </a:xfrm>
+                    <a:prstGeom prst="rect">
+                      <a:avLst/>
+                    </a:prstGeom>
+                    <a:noFill/>
+                  </pic:spPr>
+                </pic:pic>
+              </a:graphicData>
+            </a:graphic>
+          </wp:inline>
+        </w:drawing>
+      </w:r>
+    </w:p>
+    <w:p>
+      <w:pPr>
+        <w:pStyle w:val="img1"/>
+        <w:rPr/>
+      </w:pPr>
+      <w:r>
+        <w:rPr/>
+        <w:t>Рисунок 0.1 — Вигляд перших рядків</w:t>
       </w:r>
     </w:p>
     <w:p>

</xml_diff>

<commit_message>
feat :fill in the report, pending to answer the unknown questions
</commit_message>
<xml_diff>
--- a/51IP Injenerija prykladnyh zastosunkiv/1/IP_KNT-122_Onyshchenko_19_PR1.docx
+++ b/51IP Injenerija prykladnyh zastosunkiv/1/IP_KNT-122_Onyshchenko_19_PR1.docx
@@ -745,13 +745,57 @@
       </w:pPr>
       <w:r>
         <w:rPr/>
-        <w:t>Набір даних містить щоденні дані про споживання електроенергії. Місто, з якого взято ці дані, не вказане. Формат даних — C</w:t>
+        <w:t xml:space="preserve">Набір даних містить </w:t>
+      </w:r>
+      <w:r>
+        <w:rPr/>
+        <w:t>щомісячні</w:t>
+      </w:r>
+      <w:r>
+        <w:rPr/>
+        <w:t xml:space="preserve"> дані про споживання електроенергії. Місто, з якого взято ці дані, не вказане. Формат даних — C</w:t>
       </w:r>
       <w:r>
         <w:rPr>
           <w:lang w:val="en-US"/>
         </w:rPr>
-        <w:t>SV (comma separated values).</w:t>
+        <w:t>SV (</w:t>
+      </w:r>
+      <w:r>
+        <w:rPr>
+          <w:lang w:val="en-US"/>
+        </w:rPr>
+        <w:t>C</w:t>
+      </w:r>
+      <w:r>
+        <w:rPr>
+          <w:lang w:val="en-US"/>
+        </w:rPr>
+        <w:t xml:space="preserve">omma </w:t>
+      </w:r>
+      <w:r>
+        <w:rPr>
+          <w:lang w:val="en-US"/>
+        </w:rPr>
+        <w:t>S</w:t>
+      </w:r>
+      <w:r>
+        <w:rPr>
+          <w:lang w:val="en-US"/>
+        </w:rPr>
+        <w:t xml:space="preserve">eparated </w:t>
+      </w:r>
+      <w:r>
+        <w:rPr>
+          <w:lang w:val="en-US"/>
+        </w:rPr>
+        <w:t>V</w:t>
+      </w:r>
+      <w:r>
+        <w:rPr>
+          <w:lang w:val="en-US"/>
+        </w:rPr>
+        <w:t>alues).</w:t>
       </w:r>
     </w:p>
     <w:p>
@@ -851,6 +895,937 @@
     </w:p>
     <w:p>
       <w:pPr>
+        <w:pStyle w:val="p11"/>
+        <w:rPr/>
+      </w:pPr>
+      <w:r>
+        <w:rPr/>
+      </w:r>
+    </w:p>
+    <w:p>
+      <w:pPr>
+        <w:pStyle w:val="Code"/>
+        <w:rPr/>
+      </w:pPr>
+      <w:r>
+        <w:rPr/>
+        <w:t>import os</w:t>
+      </w:r>
+    </w:p>
+    <w:p>
+      <w:pPr>
+        <w:pStyle w:val="Code"/>
+        <w:rPr/>
+      </w:pPr>
+      <w:r>
+        <w:rPr/>
+        <w:t>from matplotlib import pyplot as plt</w:t>
+      </w:r>
+    </w:p>
+    <w:p>
+      <w:pPr>
+        <w:pStyle w:val="Code"/>
+        <w:rPr/>
+      </w:pPr>
+      <w:r>
+        <w:rPr/>
+        <w:t>import numpy as np</w:t>
+      </w:r>
+    </w:p>
+    <w:p>
+      <w:pPr>
+        <w:pStyle w:val="Code"/>
+        <w:rPr/>
+      </w:pPr>
+      <w:r>
+        <w:rPr/>
+        <w:t>import seaborn as sns</w:t>
+      </w:r>
+    </w:p>
+    <w:p>
+      <w:pPr>
+        <w:pStyle w:val="Code"/>
+        <w:rPr/>
+      </w:pPr>
+      <w:r>
+        <w:rPr/>
+        <w:t>import pandas as pd</w:t>
+      </w:r>
+    </w:p>
+    <w:p>
+      <w:pPr>
+        <w:pStyle w:val="Code"/>
+        <w:rPr/>
+      </w:pPr>
+      <w:r>
+        <w:rPr/>
+        <w:t>from statsmodels.tsa.seasonal import seasonal_decompose</w:t>
+      </w:r>
+    </w:p>
+    <w:p>
+      <w:pPr>
+        <w:pStyle w:val="Code"/>
+        <w:rPr/>
+      </w:pPr>
+      <w:r>
+        <w:rPr/>
+        <w:t>from statsmodels.tsa.holtwinters import ExponentialSmoothing</w:t>
+      </w:r>
+    </w:p>
+    <w:p>
+      <w:pPr>
+        <w:pStyle w:val="Code"/>
+        <w:rPr/>
+      </w:pPr>
+      <w:r>
+        <w:rPr/>
+        <w:t>import pmdarima as pm</w:t>
+      </w:r>
+    </w:p>
+    <w:p>
+      <w:pPr>
+        <w:pStyle w:val="Code"/>
+        <w:rPr/>
+      </w:pPr>
+      <w:r>
+        <w:rPr/>
+      </w:r>
+    </w:p>
+    <w:p>
+      <w:pPr>
+        <w:pStyle w:val="Code"/>
+        <w:rPr/>
+      </w:pPr>
+      <w:r>
+        <w:rPr/>
+        <w:t xml:space="preserve"># </w:t>
+      </w:r>
+      <w:r>
+        <w:rPr/>
+        <w:t>Читати дані з файлу</w:t>
+      </w:r>
+    </w:p>
+    <w:p>
+      <w:pPr>
+        <w:pStyle w:val="Code"/>
+        <w:rPr/>
+      </w:pPr>
+      <w:r>
+        <w:rPr/>
+        <w:t>current_dir = os.path.dirname(os.path.abspath(__file__))</w:t>
+      </w:r>
+    </w:p>
+    <w:p>
+      <w:pPr>
+        <w:pStyle w:val="Code"/>
+        <w:rPr/>
+      </w:pPr>
+      <w:r>
+        <w:rPr/>
+        <w:t>file_name: str = "power.csv"</w:t>
+      </w:r>
+    </w:p>
+    <w:p>
+      <w:pPr>
+        <w:pStyle w:val="Code"/>
+        <w:rPr/>
+      </w:pPr>
+      <w:r>
+        <w:rPr/>
+        <w:t>file_path: str = os.path.join(current_dir, file_name)</w:t>
+      </w:r>
+    </w:p>
+    <w:p>
+      <w:pPr>
+        <w:pStyle w:val="Code"/>
+        <w:rPr/>
+      </w:pPr>
+      <w:r>
+        <w:rPr/>
+        <w:t>df = pd.read_csv(file_path)</w:t>
+      </w:r>
+    </w:p>
+    <w:p>
+      <w:pPr>
+        <w:pStyle w:val="Code"/>
+        <w:rPr/>
+      </w:pPr>
+      <w:r>
+        <w:rPr/>
+      </w:r>
+    </w:p>
+    <w:p>
+      <w:pPr>
+        <w:pStyle w:val="Code"/>
+        <w:rPr/>
+      </w:pPr>
+      <w:r>
+        <w:rPr/>
+        <w:t xml:space="preserve"># </w:t>
+      </w:r>
+      <w:r>
+        <w:rPr/>
+        <w:t xml:space="preserve">Конвертувати стовпець з датою у формат дати </w:t>
+      </w:r>
+    </w:p>
+    <w:p>
+      <w:pPr>
+        <w:pStyle w:val="Code"/>
+        <w:rPr/>
+      </w:pPr>
+      <w:r>
+        <w:rPr/>
+        <w:t>df["DATE"] = pd.to_datetime(df["DATE"])</w:t>
+      </w:r>
+    </w:p>
+    <w:p>
+      <w:pPr>
+        <w:pStyle w:val="Code"/>
+        <w:rPr/>
+      </w:pPr>
+      <w:r>
+        <w:rPr/>
+        <w:t>df = df.set_index("DATE")</w:t>
+      </w:r>
+    </w:p>
+    <w:p>
+      <w:pPr>
+        <w:pStyle w:val="Code"/>
+        <w:rPr/>
+      </w:pPr>
+      <w:r>
+        <w:rPr/>
+        <w:t>print(df)</w:t>
+      </w:r>
+    </w:p>
+    <w:p>
+      <w:pPr>
+        <w:pStyle w:val="Code"/>
+        <w:rPr/>
+      </w:pPr>
+      <w:r>
+        <w:rPr/>
+        <w:t>average = df.rolling(window=12).mean()</w:t>
+      </w:r>
+    </w:p>
+    <w:p>
+      <w:pPr>
+        <w:pStyle w:val="Code"/>
+        <w:rPr/>
+      </w:pPr>
+      <w:r>
+        <w:rPr/>
+      </w:r>
+    </w:p>
+    <w:p>
+      <w:pPr>
+        <w:pStyle w:val="Code"/>
+        <w:rPr/>
+      </w:pPr>
+      <w:r>
+        <w:rPr/>
+        <w:t xml:space="preserve"># </w:t>
+      </w:r>
+      <w:r>
+        <w:rPr/>
+        <w:t>Графік первинних даних</w:t>
+      </w:r>
+    </w:p>
+    <w:p>
+      <w:pPr>
+        <w:pStyle w:val="Code"/>
+        <w:rPr/>
+      </w:pPr>
+      <w:r>
+        <w:rPr/>
+        <w:t>plt.figure(figsize=(12, 6))</w:t>
+      </w:r>
+    </w:p>
+    <w:p>
+      <w:pPr>
+        <w:pStyle w:val="Code"/>
+        <w:rPr/>
+      </w:pPr>
+      <w:r>
+        <w:rPr/>
+        <w:t>plt.plot(df, color="tab:blue", label="Original Data")</w:t>
+      </w:r>
+    </w:p>
+    <w:p>
+      <w:pPr>
+        <w:pStyle w:val="Code"/>
+        <w:rPr/>
+      </w:pPr>
+      <w:r>
+        <w:rPr/>
+        <w:t>plt.plot(average, color="tab:red", label="Average Data")</w:t>
+      </w:r>
+    </w:p>
+    <w:p>
+      <w:pPr>
+        <w:pStyle w:val="Code"/>
+        <w:rPr/>
+      </w:pPr>
+      <w:r>
+        <w:rPr/>
+        <w:t>plt.title("Rolling Statistics", size=14)</w:t>
+      </w:r>
+    </w:p>
+    <w:p>
+      <w:pPr>
+        <w:pStyle w:val="Code"/>
+        <w:rPr/>
+      </w:pPr>
+      <w:r>
+        <w:rPr/>
+        <w:t>plt.xlabel("Date", size=12)</w:t>
+      </w:r>
+    </w:p>
+    <w:p>
+      <w:pPr>
+        <w:pStyle w:val="Code"/>
+        <w:rPr/>
+      </w:pPr>
+      <w:r>
+        <w:rPr/>
+        <w:t>plt.ylabel("Power Consumption")</w:t>
+      </w:r>
+    </w:p>
+    <w:p>
+      <w:pPr>
+        <w:pStyle w:val="Code"/>
+        <w:rPr/>
+      </w:pPr>
+      <w:r>
+        <w:rPr/>
+        <w:t>plt.legend()</w:t>
+      </w:r>
+    </w:p>
+    <w:p>
+      <w:pPr>
+        <w:pStyle w:val="Code"/>
+        <w:rPr/>
+      </w:pPr>
+      <w:r>
+        <w:rPr/>
+        <w:t>plt.grid()</w:t>
+      </w:r>
+    </w:p>
+    <w:p>
+      <w:pPr>
+        <w:pStyle w:val="Code"/>
+        <w:rPr/>
+      </w:pPr>
+      <w:r>
+        <w:rPr/>
+        <w:t>plt.show()</w:t>
+      </w:r>
+    </w:p>
+    <w:p>
+      <w:pPr>
+        <w:pStyle w:val="Code"/>
+        <w:rPr/>
+      </w:pPr>
+      <w:r>
+        <w:rPr/>
+      </w:r>
+    </w:p>
+    <w:p>
+      <w:pPr>
+        <w:pStyle w:val="Code"/>
+        <w:rPr/>
+      </w:pPr>
+      <w:r>
+        <w:rPr/>
+        <w:t xml:space="preserve"># </w:t>
+      </w:r>
+      <w:r>
+        <w:rPr/>
+        <w:t>Декомпозиція даних на сезональні, періодичні, тощо.</w:t>
+      </w:r>
+    </w:p>
+    <w:p>
+      <w:pPr>
+        <w:pStyle w:val="Code"/>
+        <w:rPr/>
+      </w:pPr>
+      <w:r>
+        <w:rPr/>
+        <w:t>decomp = seasonal_decompose(df, model="additive", period=12)</w:t>
+      </w:r>
+    </w:p>
+    <w:p>
+      <w:pPr>
+        <w:pStyle w:val="Code"/>
+        <w:rPr/>
+      </w:pPr>
+      <w:r>
+        <w:rPr/>
+        <w:t>decomp.plot()</w:t>
+      </w:r>
+    </w:p>
+    <w:p>
+      <w:pPr>
+        <w:pStyle w:val="Code"/>
+        <w:rPr/>
+      </w:pPr>
+      <w:r>
+        <w:rPr/>
+        <w:t>plt.show()</w:t>
+      </w:r>
+    </w:p>
+    <w:p>
+      <w:pPr>
+        <w:pStyle w:val="Code"/>
+        <w:rPr/>
+      </w:pPr>
+      <w:r>
+        <w:rPr/>
+      </w:r>
+    </w:p>
+    <w:p>
+      <w:pPr>
+        <w:pStyle w:val="Code"/>
+        <w:rPr/>
+      </w:pPr>
+      <w:r>
+        <w:rPr/>
+        <w:t xml:space="preserve"># </w:t>
+      </w:r>
+      <w:r>
+        <w:rPr/>
+        <w:t>Розділення даних на тестові та навчальні</w:t>
+      </w:r>
+    </w:p>
+    <w:p>
+      <w:pPr>
+        <w:pStyle w:val="Code"/>
+        <w:rPr/>
+      </w:pPr>
+      <w:r>
+        <w:rPr/>
+        <w:t>train = df[:-12]</w:t>
+      </w:r>
+    </w:p>
+    <w:p>
+      <w:pPr>
+        <w:pStyle w:val="Code"/>
+        <w:rPr/>
+      </w:pPr>
+      <w:r>
+        <w:rPr/>
+        <w:t>test = df[-12:]</w:t>
+      </w:r>
+    </w:p>
+    <w:p>
+      <w:pPr>
+        <w:pStyle w:val="Code"/>
+        <w:rPr/>
+      </w:pPr>
+      <w:r>
+        <w:rPr/>
+      </w:r>
+    </w:p>
+    <w:p>
+      <w:pPr>
+        <w:pStyle w:val="Code"/>
+        <w:rPr/>
+      </w:pPr>
+      <w:r>
+        <w:rPr/>
+        <w:t xml:space="preserve"># </w:t>
+      </w:r>
+      <w:r>
+        <w:rPr/>
+        <w:t xml:space="preserve">Застосувати модель </w:t>
+      </w:r>
+      <w:r>
+        <w:rPr/>
+        <w:t xml:space="preserve">ARIMA </w:t>
+      </w:r>
+    </w:p>
+    <w:p>
+      <w:pPr>
+        <w:pStyle w:val="Code"/>
+        <w:rPr/>
+      </w:pPr>
+      <w:r>
+        <w:rPr/>
+        <w:t>model = pm.auto_arima(</w:t>
+      </w:r>
+    </w:p>
+    <w:p>
+      <w:pPr>
+        <w:pStyle w:val="Code"/>
+        <w:rPr/>
+      </w:pPr>
+      <w:r>
+        <w:rPr/>
+        <w:t xml:space="preserve">    </w:t>
+      </w:r>
+      <w:r>
+        <w:rPr/>
+        <w:t>train,</w:t>
+      </w:r>
+    </w:p>
+    <w:p>
+      <w:pPr>
+        <w:pStyle w:val="Code"/>
+        <w:rPr/>
+      </w:pPr>
+      <w:r>
+        <w:rPr/>
+        <w:t xml:space="preserve">    </w:t>
+      </w:r>
+      <w:r>
+        <w:rPr/>
+        <w:t>seasonal=False,</w:t>
+      </w:r>
+    </w:p>
+    <w:p>
+      <w:pPr>
+        <w:pStyle w:val="Code"/>
+        <w:rPr/>
+      </w:pPr>
+      <w:r>
+        <w:rPr/>
+        <w:t xml:space="preserve">    </w:t>
+      </w:r>
+      <w:r>
+        <w:rPr/>
+        <w:t>m=12,</w:t>
+      </w:r>
+    </w:p>
+    <w:p>
+      <w:pPr>
+        <w:pStyle w:val="Code"/>
+        <w:rPr/>
+      </w:pPr>
+      <w:r>
+        <w:rPr/>
+        <w:t xml:space="preserve">    </w:t>
+      </w:r>
+      <w:r>
+        <w:rPr/>
+        <w:t>trace=True,</w:t>
+      </w:r>
+    </w:p>
+    <w:p>
+      <w:pPr>
+        <w:pStyle w:val="Code"/>
+        <w:rPr/>
+      </w:pPr>
+      <w:r>
+        <w:rPr/>
+        <w:t xml:space="preserve">    </w:t>
+      </w:r>
+      <w:r>
+        <w:rPr/>
+        <w:t>error_action="ignore",</w:t>
+      </w:r>
+    </w:p>
+    <w:p>
+      <w:pPr>
+        <w:pStyle w:val="Code"/>
+        <w:rPr/>
+      </w:pPr>
+      <w:r>
+        <w:rPr/>
+        <w:t xml:space="preserve">    </w:t>
+      </w:r>
+      <w:r>
+        <w:rPr/>
+        <w:t>suppress_warnings=True,</w:t>
+      </w:r>
+    </w:p>
+    <w:p>
+      <w:pPr>
+        <w:pStyle w:val="Code"/>
+        <w:rPr/>
+      </w:pPr>
+      <w:r>
+        <w:rPr/>
+        <w:t>)</w:t>
+      </w:r>
+    </w:p>
+    <w:p>
+      <w:pPr>
+        <w:pStyle w:val="Code"/>
+        <w:rPr/>
+      </w:pPr>
+      <w:r>
+        <w:rPr/>
+        <w:t>print(model.summary())</w:t>
+      </w:r>
+    </w:p>
+    <w:p>
+      <w:pPr>
+        <w:pStyle w:val="Code"/>
+        <w:rPr/>
+      </w:pPr>
+      <w:r>
+        <w:rPr/>
+        <w:t>forecast = model.predict(n_preiods=12)</w:t>
+      </w:r>
+    </w:p>
+    <w:p>
+      <w:pPr>
+        <w:pStyle w:val="Code"/>
+        <w:rPr/>
+      </w:pPr>
+      <w:r>
+        <w:rPr/>
+        <w:t>forecast = pd.Series(forecast, index=test.index)</w:t>
+      </w:r>
+    </w:p>
+    <w:p>
+      <w:pPr>
+        <w:pStyle w:val="Code"/>
+        <w:rPr/>
+      </w:pPr>
+      <w:r>
+        <w:rPr/>
+      </w:r>
+    </w:p>
+    <w:p>
+      <w:pPr>
+        <w:pStyle w:val="Code"/>
+        <w:rPr/>
+      </w:pPr>
+      <w:r>
+        <w:rPr/>
+        <w:t xml:space="preserve"># </w:t>
+      </w:r>
+      <w:r>
+        <w:rPr/>
+        <w:t>Графік отриманих результатів</w:t>
+      </w:r>
+    </w:p>
+    <w:p>
+      <w:pPr>
+        <w:pStyle w:val="Code"/>
+        <w:rPr/>
+      </w:pPr>
+      <w:r>
+        <w:rPr/>
+        <w:t>plt.figure(figsize=(12, 6))</w:t>
+      </w:r>
+    </w:p>
+    <w:p>
+      <w:pPr>
+        <w:pStyle w:val="Code"/>
+        <w:rPr/>
+      </w:pPr>
+      <w:r>
+        <w:rPr/>
+        <w:t>plt.plot(train, label="Training Data")</w:t>
+      </w:r>
+    </w:p>
+    <w:p>
+      <w:pPr>
+        <w:pStyle w:val="Code"/>
+        <w:rPr/>
+      </w:pPr>
+      <w:r>
+        <w:rPr/>
+        <w:t>plt.plot(test, label="Actual Values", linewidth=2)</w:t>
+      </w:r>
+    </w:p>
+    <w:p>
+      <w:pPr>
+        <w:pStyle w:val="Code"/>
+        <w:rPr/>
+      </w:pPr>
+      <w:r>
+        <w:rPr/>
+        <w:t>plt.plot(forecast, label="Forecasted Values", linestyle="--")</w:t>
+      </w:r>
+    </w:p>
+    <w:p>
+      <w:pPr>
+        <w:pStyle w:val="Code"/>
+        <w:rPr/>
+      </w:pPr>
+      <w:r>
+        <w:rPr/>
+        <w:t>plt.title("ARIMA Forecast")</w:t>
+      </w:r>
+    </w:p>
+    <w:p>
+      <w:pPr>
+        <w:pStyle w:val="Code"/>
+        <w:rPr/>
+      </w:pPr>
+      <w:r>
+        <w:rPr/>
+        <w:t>plt.xlabel("Time")</w:t>
+      </w:r>
+    </w:p>
+    <w:p>
+      <w:pPr>
+        <w:pStyle w:val="Code"/>
+        <w:rPr/>
+      </w:pPr>
+      <w:r>
+        <w:rPr/>
+        <w:t>plt.ylabel("Value")</w:t>
+      </w:r>
+    </w:p>
+    <w:p>
+      <w:pPr>
+        <w:pStyle w:val="Code"/>
+        <w:rPr/>
+      </w:pPr>
+      <w:r>
+        <w:rPr/>
+        <w:t>plt.legend()</w:t>
+      </w:r>
+    </w:p>
+    <w:p>
+      <w:pPr>
+        <w:pStyle w:val="Code"/>
+        <w:rPr/>
+      </w:pPr>
+      <w:r>
+        <w:rPr/>
+        <w:t>plt.grid()</w:t>
+      </w:r>
+    </w:p>
+    <w:p>
+      <w:pPr>
+        <w:pStyle w:val="Code"/>
+        <w:rPr/>
+      </w:pPr>
+      <w:r>
+        <w:rPr/>
+        <w:t>plt.show()</w:t>
+      </w:r>
+    </w:p>
+    <w:p>
+      <w:pPr>
+        <w:pStyle w:val="Code"/>
+        <w:rPr/>
+      </w:pPr>
+      <w:r>
+        <w:rPr/>
+      </w:r>
+    </w:p>
+    <w:p>
+      <w:pPr>
+        <w:pStyle w:val="Code"/>
+        <w:rPr/>
+      </w:pPr>
+      <w:r>
+        <w:rPr/>
+        <w:t xml:space="preserve"># </w:t>
+      </w:r>
+      <w:r>
+        <w:rPr/>
+        <w:t xml:space="preserve">Застосувати модель </w:t>
+      </w:r>
+      <w:r>
+        <w:rPr/>
+        <w:t>ETS</w:t>
+      </w:r>
+    </w:p>
+    <w:p>
+      <w:pPr>
+        <w:pStyle w:val="Code"/>
+        <w:rPr/>
+      </w:pPr>
+      <w:r>
+        <w:rPr/>
+        <w:t>ets_model = ExponentialSmoothing(</w:t>
+      </w:r>
+    </w:p>
+    <w:p>
+      <w:pPr>
+        <w:pStyle w:val="Code"/>
+        <w:rPr/>
+      </w:pPr>
+      <w:r>
+        <w:rPr/>
+        <w:t xml:space="preserve">    </w:t>
+      </w:r>
+      <w:r>
+        <w:rPr/>
+        <w:t>train, seasonal="add", trend="add", seasonal_periods=12</w:t>
+      </w:r>
+    </w:p>
+    <w:p>
+      <w:pPr>
+        <w:pStyle w:val="Code"/>
+        <w:rPr/>
+      </w:pPr>
+      <w:r>
+        <w:rPr/>
+        <w:t>)</w:t>
+      </w:r>
+    </w:p>
+    <w:p>
+      <w:pPr>
+        <w:pStyle w:val="Code"/>
+        <w:rPr/>
+      </w:pPr>
+      <w:r>
+        <w:rPr/>
+        <w:t>ets_fit = ets_model.fit()</w:t>
+      </w:r>
+    </w:p>
+    <w:p>
+      <w:pPr>
+        <w:pStyle w:val="Code"/>
+        <w:rPr/>
+      </w:pPr>
+      <w:r>
+        <w:rPr/>
+        <w:t>forecast = ets_fit.forecast(steps=12)</w:t>
+      </w:r>
+    </w:p>
+    <w:p>
+      <w:pPr>
+        <w:pStyle w:val="Code"/>
+        <w:rPr/>
+      </w:pPr>
+      <w:r>
+        <w:rPr/>
+        <w:t>forecast = pd.Series(forecast, index=test.index)</w:t>
+      </w:r>
+    </w:p>
+    <w:p>
+      <w:pPr>
+        <w:pStyle w:val="Code"/>
+        <w:rPr/>
+      </w:pPr>
+      <w:r>
+        <w:rPr/>
+      </w:r>
+    </w:p>
+    <w:p>
+      <w:pPr>
+        <w:pStyle w:val="Code"/>
+        <w:rPr/>
+      </w:pPr>
+      <w:r>
+        <w:rPr/>
+        <w:t xml:space="preserve"># </w:t>
+      </w:r>
+      <w:r>
+        <w:rPr/>
+        <w:t xml:space="preserve">Графік отриманих результатів </w:t>
+      </w:r>
+    </w:p>
+    <w:p>
+      <w:pPr>
+        <w:pStyle w:val="Code"/>
+        <w:rPr/>
+      </w:pPr>
+      <w:r>
+        <w:rPr/>
+        <w:t>plt.figure(figsize=(12, 6))</w:t>
+      </w:r>
+    </w:p>
+    <w:p>
+      <w:pPr>
+        <w:pStyle w:val="Code"/>
+        <w:rPr/>
+      </w:pPr>
+      <w:r>
+        <w:rPr/>
+        <w:t>plt.plot(train, label="Training Data")</w:t>
+      </w:r>
+    </w:p>
+    <w:p>
+      <w:pPr>
+        <w:pStyle w:val="Code"/>
+        <w:rPr/>
+      </w:pPr>
+      <w:r>
+        <w:rPr/>
+        <w:t>plt.plot(test, label="Actual Values", linewidth=2)</w:t>
+      </w:r>
+    </w:p>
+    <w:p>
+      <w:pPr>
+        <w:pStyle w:val="Code"/>
+        <w:rPr/>
+      </w:pPr>
+      <w:r>
+        <w:rPr/>
+        <w:t>plt.plot(forecast, label="Forecasted Values", linestyle="--")</w:t>
+      </w:r>
+    </w:p>
+    <w:p>
+      <w:pPr>
+        <w:pStyle w:val="Code"/>
+        <w:rPr/>
+      </w:pPr>
+      <w:r>
+        <w:rPr/>
+        <w:t>plt.title("ETS Forecast")</w:t>
+      </w:r>
+    </w:p>
+    <w:p>
+      <w:pPr>
+        <w:pStyle w:val="Code"/>
+        <w:rPr/>
+      </w:pPr>
+      <w:r>
+        <w:rPr/>
+        <w:t>plt.xlabel("Time")</w:t>
+      </w:r>
+    </w:p>
+    <w:p>
+      <w:pPr>
+        <w:pStyle w:val="Code"/>
+        <w:rPr/>
+      </w:pPr>
+      <w:r>
+        <w:rPr/>
+        <w:t>plt.ylabel("Value")</w:t>
+      </w:r>
+    </w:p>
+    <w:p>
+      <w:pPr>
+        <w:pStyle w:val="Code"/>
+        <w:rPr/>
+      </w:pPr>
+      <w:r>
+        <w:rPr/>
+        <w:t>plt.legend()</w:t>
+      </w:r>
+    </w:p>
+    <w:p>
+      <w:pPr>
+        <w:pStyle w:val="Code"/>
+        <w:rPr/>
+      </w:pPr>
+      <w:r>
+        <w:rPr/>
+        <w:t>plt.grid()</w:t>
+      </w:r>
+    </w:p>
+    <w:p>
+      <w:pPr>
+        <w:pStyle w:val="Code"/>
+        <w:rPr/>
+      </w:pPr>
+      <w:r>
+        <w:rPr/>
+        <w:t>plt.show()</w:t>
+      </w:r>
+    </w:p>
+    <w:p>
+      <w:pPr>
+        <w:pStyle w:val="p11"/>
+        <w:rPr/>
+      </w:pPr>
+      <w:r>
+        <w:rPr/>
+      </w:r>
+    </w:p>
+    <w:p>
+      <w:pPr>
         <w:pStyle w:val="h11"/>
         <w:rPr/>
       </w:pPr>
@@ -861,6 +1836,405 @@
     </w:p>
     <w:p>
       <w:pPr>
+        <w:pStyle w:val="p11"/>
+        <w:rPr/>
+      </w:pPr>
+      <w:r>
+        <w:rPr/>
+      </w:r>
+    </w:p>
+    <w:p>
+      <w:pPr>
+        <w:pStyle w:val="p11"/>
+        <w:rPr/>
+      </w:pPr>
+      <w:r>
+        <w:rPr/>
+        <w:t>Результати виконання програми наведено на рисунках нижче.</w:t>
+      </w:r>
+    </w:p>
+    <w:p>
+      <w:pPr>
+        <w:pStyle w:val="p11"/>
+        <w:rPr/>
+      </w:pPr>
+      <w:r>
+        <w:rPr/>
+      </w:r>
+    </w:p>
+    <w:p>
+      <w:pPr>
+        <w:pStyle w:val="img1"/>
+        <w:rPr/>
+      </w:pPr>
+      <w:r>
+        <w:rPr/>
+        <w:drawing>
+          <wp:inline distT="0" distB="0" distL="0" distR="0">
+            <wp:extent cx="5731510" cy="2865755"/>
+            <wp:effectExtent l="0" t="0" r="0" b="0"/>
+            <wp:docPr id="2" name="Зображення3"/>
+            <wp:cNvGraphicFramePr>
+              <a:graphicFrameLocks xmlns:a="http://schemas.openxmlformats.org/drawingml/2006/main" noChangeAspect="1"/>
+            </wp:cNvGraphicFramePr>
+            <a:graphic xmlns:a="http://schemas.openxmlformats.org/drawingml/2006/main">
+              <a:graphicData uri="http://schemas.openxmlformats.org/drawingml/2006/picture">
+                <pic:pic xmlns:pic="http://schemas.openxmlformats.org/drawingml/2006/picture">
+                  <pic:nvPicPr>
+                    <pic:cNvPr id="2" name="Зображення3"/>
+                    <pic:cNvPicPr>
+                      <a:picLocks noChangeAspect="1" noChangeArrowheads="1"/>
+                    </pic:cNvPicPr>
+                  </pic:nvPicPr>
+                  <pic:blipFill>
+                    <a:blip r:embed="rId5"/>
+                    <a:stretch>
+                      <a:fillRect/>
+                    </a:stretch>
+                  </pic:blipFill>
+                  <pic:spPr bwMode="auto">
+                    <a:xfrm>
+                      <a:off x="0" y="0"/>
+                      <a:ext cx="5731510" cy="2865755"/>
+                    </a:xfrm>
+                    <a:prstGeom prst="rect">
+                      <a:avLst/>
+                    </a:prstGeom>
+                    <a:noFill/>
+                  </pic:spPr>
+                </pic:pic>
+              </a:graphicData>
+            </a:graphic>
+          </wp:inline>
+        </w:drawing>
+      </w:r>
+    </w:p>
+    <w:p>
+      <w:pPr>
+        <w:pStyle w:val="img1"/>
+        <w:rPr/>
+      </w:pPr>
+      <w:r>
+        <w:rPr/>
+        <w:t>Рисунок 1.1 — Початкові дані</w:t>
+      </w:r>
+    </w:p>
+    <w:p>
+      <w:pPr>
+        <w:pStyle w:val="img1"/>
+        <w:rPr/>
+      </w:pPr>
+      <w:r>
+        <w:rPr/>
+      </w:r>
+    </w:p>
+    <w:p>
+      <w:pPr>
+        <w:pStyle w:val="img1"/>
+        <w:rPr/>
+      </w:pPr>
+      <w:r>
+        <w:rPr/>
+        <w:drawing>
+          <wp:inline distT="0" distB="0" distL="0" distR="0">
+            <wp:extent cx="5731510" cy="4298315"/>
+            <wp:effectExtent l="0" t="0" r="0" b="0"/>
+            <wp:docPr id="3" name="Зображення4"/>
+            <wp:cNvGraphicFramePr>
+              <a:graphicFrameLocks xmlns:a="http://schemas.openxmlformats.org/drawingml/2006/main" noChangeAspect="1"/>
+            </wp:cNvGraphicFramePr>
+            <a:graphic xmlns:a="http://schemas.openxmlformats.org/drawingml/2006/main">
+              <a:graphicData uri="http://schemas.openxmlformats.org/drawingml/2006/picture">
+                <pic:pic xmlns:pic="http://schemas.openxmlformats.org/drawingml/2006/picture">
+                  <pic:nvPicPr>
+                    <pic:cNvPr id="3" name="Зображення4"/>
+                    <pic:cNvPicPr>
+                      <a:picLocks noChangeAspect="1" noChangeArrowheads="1"/>
+                    </pic:cNvPicPr>
+                  </pic:nvPicPr>
+                  <pic:blipFill>
+                    <a:blip r:embed="rId6"/>
+                    <a:stretch>
+                      <a:fillRect/>
+                    </a:stretch>
+                  </pic:blipFill>
+                  <pic:spPr bwMode="auto">
+                    <a:xfrm>
+                      <a:off x="0" y="0"/>
+                      <a:ext cx="5731510" cy="4298315"/>
+                    </a:xfrm>
+                    <a:prstGeom prst="rect">
+                      <a:avLst/>
+                    </a:prstGeom>
+                    <a:noFill/>
+                  </pic:spPr>
+                </pic:pic>
+              </a:graphicData>
+            </a:graphic>
+          </wp:inline>
+        </w:drawing>
+      </w:r>
+    </w:p>
+    <w:p>
+      <w:pPr>
+        <w:pStyle w:val="img1"/>
+        <w:rPr/>
+      </w:pPr>
+      <w:r>
+        <w:rPr/>
+        <w:t>Рисунок 1.2 — Дані після декомпозиції</w:t>
+      </w:r>
+    </w:p>
+    <w:p>
+      <w:pPr>
+        <w:pStyle w:val="img1"/>
+        <w:rPr/>
+      </w:pPr>
+      <w:r>
+        <w:rPr/>
+      </w:r>
+    </w:p>
+    <w:p>
+      <w:pPr>
+        <w:pStyle w:val="img1"/>
+        <w:rPr/>
+      </w:pPr>
+      <w:r>
+        <w:rPr/>
+      </w:r>
+    </w:p>
+    <w:p>
+      <w:pPr>
+        <w:pStyle w:val="img1"/>
+        <w:rPr/>
+      </w:pPr>
+      <w:r>
+        <w:rPr/>
+        <w:drawing>
+          <wp:inline distT="0" distB="0" distL="0" distR="0">
+            <wp:extent cx="5731510" cy="2865755"/>
+            <wp:effectExtent l="0" t="0" r="0" b="0"/>
+            <wp:docPr id="4" name="Зображення5"/>
+            <wp:cNvGraphicFramePr>
+              <a:graphicFrameLocks xmlns:a="http://schemas.openxmlformats.org/drawingml/2006/main" noChangeAspect="1"/>
+            </wp:cNvGraphicFramePr>
+            <a:graphic xmlns:a="http://schemas.openxmlformats.org/drawingml/2006/main">
+              <a:graphicData uri="http://schemas.openxmlformats.org/drawingml/2006/picture">
+                <pic:pic xmlns:pic="http://schemas.openxmlformats.org/drawingml/2006/picture">
+                  <pic:nvPicPr>
+                    <pic:cNvPr id="4" name="Зображення5"/>
+                    <pic:cNvPicPr>
+                      <a:picLocks noChangeAspect="1" noChangeArrowheads="1"/>
+                    </pic:cNvPicPr>
+                  </pic:nvPicPr>
+                  <pic:blipFill>
+                    <a:blip r:embed="rId7"/>
+                    <a:stretch>
+                      <a:fillRect/>
+                    </a:stretch>
+                  </pic:blipFill>
+                  <pic:spPr bwMode="auto">
+                    <a:xfrm>
+                      <a:off x="0" y="0"/>
+                      <a:ext cx="5731510" cy="2865755"/>
+                    </a:xfrm>
+                    <a:prstGeom prst="rect">
+                      <a:avLst/>
+                    </a:prstGeom>
+                    <a:noFill/>
+                  </pic:spPr>
+                </pic:pic>
+              </a:graphicData>
+            </a:graphic>
+          </wp:inline>
+        </w:drawing>
+      </w:r>
+    </w:p>
+    <w:p>
+      <w:pPr>
+        <w:pStyle w:val="img1"/>
+        <w:rPr/>
+      </w:pPr>
+      <w:r>
+        <w:rPr/>
+        <w:t xml:space="preserve">Рисунок 1.3 — Результати роботи моделі </w:t>
+      </w:r>
+      <w:r>
+        <w:rPr>
+          <w:lang w:val="en-US"/>
+        </w:rPr>
+        <w:t>ARIMA</w:t>
+      </w:r>
+    </w:p>
+    <w:p>
+      <w:pPr>
+        <w:pStyle w:val="img1"/>
+        <w:rPr/>
+      </w:pPr>
+      <w:r>
+        <w:rPr/>
+      </w:r>
+    </w:p>
+    <w:p>
+      <w:pPr>
+        <w:pStyle w:val="img1"/>
+        <w:rPr/>
+      </w:pPr>
+      <w:r>
+        <w:rPr/>
+        <w:drawing>
+          <wp:inline distT="0" distB="0" distL="0" distR="0">
+            <wp:extent cx="5731510" cy="2865755"/>
+            <wp:effectExtent l="0" t="0" r="0" b="0"/>
+            <wp:docPr id="5" name="Зображення6"/>
+            <wp:cNvGraphicFramePr>
+              <a:graphicFrameLocks xmlns:a="http://schemas.openxmlformats.org/drawingml/2006/main" noChangeAspect="1"/>
+            </wp:cNvGraphicFramePr>
+            <a:graphic xmlns:a="http://schemas.openxmlformats.org/drawingml/2006/main">
+              <a:graphicData uri="http://schemas.openxmlformats.org/drawingml/2006/picture">
+                <pic:pic xmlns:pic="http://schemas.openxmlformats.org/drawingml/2006/picture">
+                  <pic:nvPicPr>
+                    <pic:cNvPr id="5" name="Зображення6"/>
+                    <pic:cNvPicPr>
+                      <a:picLocks noChangeAspect="1" noChangeArrowheads="1"/>
+                    </pic:cNvPicPr>
+                  </pic:nvPicPr>
+                  <pic:blipFill>
+                    <a:blip r:embed="rId8"/>
+                    <a:stretch>
+                      <a:fillRect/>
+                    </a:stretch>
+                  </pic:blipFill>
+                  <pic:spPr bwMode="auto">
+                    <a:xfrm>
+                      <a:off x="0" y="0"/>
+                      <a:ext cx="5731510" cy="2865755"/>
+                    </a:xfrm>
+                    <a:prstGeom prst="rect">
+                      <a:avLst/>
+                    </a:prstGeom>
+                    <a:noFill/>
+                  </pic:spPr>
+                </pic:pic>
+              </a:graphicData>
+            </a:graphic>
+          </wp:inline>
+        </w:drawing>
+      </w:r>
+    </w:p>
+    <w:p>
+      <w:pPr>
+        <w:pStyle w:val="img1"/>
+        <w:rPr/>
+      </w:pPr>
+      <w:r>
+        <w:rPr/>
+        <w:t xml:space="preserve">Рисунок 1.4 — Результати роботи моделі </w:t>
+      </w:r>
+      <w:r>
+        <w:rPr>
+          <w:lang w:val="en-US"/>
+        </w:rPr>
+        <w:t>ETS</w:t>
+      </w:r>
+    </w:p>
+    <w:p>
+      <w:pPr>
+        <w:pStyle w:val="img1"/>
+        <w:rPr/>
+      </w:pPr>
+      <w:r>
+        <w:rPr/>
+      </w:r>
+    </w:p>
+    <w:p>
+      <w:pPr>
+        <w:pStyle w:val="img1"/>
+        <w:rPr/>
+      </w:pPr>
+      <w:r>
+        <w:rPr/>
+        <w:drawing>
+          <wp:inline distT="0" distB="0" distL="0" distR="0">
+            <wp:extent cx="5731510" cy="3797935"/>
+            <wp:effectExtent l="0" t="0" r="0" b="0"/>
+            <wp:docPr id="6" name="Зображення2"/>
+            <wp:cNvGraphicFramePr>
+              <a:graphicFrameLocks xmlns:a="http://schemas.openxmlformats.org/drawingml/2006/main" noChangeAspect="1"/>
+            </wp:cNvGraphicFramePr>
+            <a:graphic xmlns:a="http://schemas.openxmlformats.org/drawingml/2006/main">
+              <a:graphicData uri="http://schemas.openxmlformats.org/drawingml/2006/picture">
+                <pic:pic xmlns:pic="http://schemas.openxmlformats.org/drawingml/2006/picture">
+                  <pic:nvPicPr>
+                    <pic:cNvPr id="6" name="Зображення2"/>
+                    <pic:cNvPicPr>
+                      <a:picLocks noChangeAspect="1" noChangeArrowheads="1"/>
+                    </pic:cNvPicPr>
+                  </pic:nvPicPr>
+                  <pic:blipFill>
+                    <a:blip r:embed="rId9"/>
+                    <a:stretch>
+                      <a:fillRect/>
+                    </a:stretch>
+                  </pic:blipFill>
+                  <pic:spPr bwMode="auto">
+                    <a:xfrm>
+                      <a:off x="0" y="0"/>
+                      <a:ext cx="5731510" cy="3797935"/>
+                    </a:xfrm>
+                    <a:prstGeom prst="rect">
+                      <a:avLst/>
+                    </a:prstGeom>
+                    <a:noFill/>
+                  </pic:spPr>
+                </pic:pic>
+              </a:graphicData>
+            </a:graphic>
+          </wp:inline>
+        </w:drawing>
+      </w:r>
+    </w:p>
+    <w:p>
+      <w:pPr>
+        <w:pStyle w:val="img1"/>
+        <w:rPr/>
+      </w:pPr>
+      <w:r>
+        <w:rPr/>
+        <w:t>Рисунок 1.</w:t>
+      </w:r>
+      <w:r>
+        <w:rPr>
+          <w:lang w:val="en-US"/>
+        </w:rPr>
+        <w:t xml:space="preserve">5 </w:t>
+      </w:r>
+      <w:r>
+        <w:rPr/>
+        <w:t xml:space="preserve">— Таблиця результатів роботи моделі </w:t>
+      </w:r>
+      <w:r>
+        <w:rPr>
+          <w:lang w:val="en-US"/>
+        </w:rPr>
+        <w:t>ARIMA</w:t>
+      </w:r>
+    </w:p>
+    <w:p>
+      <w:pPr>
+        <w:pStyle w:val="p11"/>
+        <w:rPr>
+          <w:lang w:val="en-US"/>
+        </w:rPr>
+      </w:pPr>
+      <w:r>
+        <w:rPr>
+          <w:lang w:val="en-US"/>
+        </w:rPr>
+      </w:r>
+    </w:p>
+    <w:p>
+      <w:pPr>
         <w:pStyle w:val="h11"/>
         <w:rPr/>
       </w:pPr>
@@ -886,6 +2260,87 @@
       <w:r>
         <w:rPr/>
         <w:t>Отже, було навчено реалізовувати програмні проєкти у сфері інженерії програмного забезпечення, пов’язані з необхідністю обробки часових послідовностей даних.</w:t>
+      </w:r>
+    </w:p>
+    <w:p>
+      <w:pPr>
+        <w:pStyle w:val="p11"/>
+        <w:rPr/>
+      </w:pPr>
+      <w:r>
+        <w:rPr/>
+      </w:r>
+    </w:p>
+    <w:p>
+      <w:pPr>
+        <w:pStyle w:val="p11"/>
+        <w:rPr/>
+      </w:pPr>
+      <w:r>
+        <w:rPr/>
+        <w:t>Що означають дані в таблиці.</w:t>
+      </w:r>
+    </w:p>
+    <w:p>
+      <w:pPr>
+        <w:pStyle w:val="p11"/>
+        <w:rPr/>
+      </w:pPr>
+      <w:r>
+        <w:rPr/>
+        <w:t xml:space="preserve">В чому суть роботи </w:t>
+      </w:r>
+      <w:r>
+        <w:rPr>
+          <w:lang w:val="en-US"/>
+        </w:rPr>
+        <w:t xml:space="preserve">ARIMA (SARIMAX, </w:t>
+      </w:r>
+      <w:r>
+        <w:rPr>
+          <w:lang w:val="uk-UA"/>
+        </w:rPr>
+        <w:t>як в програмі</w:t>
+      </w:r>
+      <w:r>
+        <w:rPr>
+          <w:lang w:val="en-US"/>
+        </w:rPr>
+        <w:t>).</w:t>
+      </w:r>
+    </w:p>
+    <w:p>
+      <w:pPr>
+        <w:pStyle w:val="p11"/>
+        <w:rPr>
+          <w:lang w:val="uk-UA"/>
+        </w:rPr>
+      </w:pPr>
+      <w:r>
+        <w:rPr>
+          <w:lang w:val="uk-UA"/>
+        </w:rPr>
+        <w:t xml:space="preserve">В чому суть роботи </w:t>
+      </w:r>
+      <w:r>
+        <w:rPr>
+          <w:lang w:val="en-US"/>
+        </w:rPr>
+        <w:t>ETS.</w:t>
+      </w:r>
+    </w:p>
+    <w:p>
+      <w:pPr>
+        <w:pStyle w:val="p11"/>
+        <w:rPr>
+          <w:lang w:val="uk-UA"/>
+        </w:rPr>
+      </w:pPr>
+      <w:r>
+        <w:rPr>
+          <w:lang w:val="uk-UA"/>
+        </w:rPr>
+        <w:t>Чим вони відрізняються.</w:t>
       </w:r>
     </w:p>
     <w:p>
@@ -1912,8 +3367,8 @@
       <w:lang w:val="en-US" w:eastAsia="uk-UA"/>
     </w:rPr>
   </w:style>
-  <w:style w:type="character" w:styleId="user">
-    <w:name w:val="Символ нумерації (user)"/>
+  <w:style w:type="character" w:styleId="Style12">
+    <w:name w:val="Символ нумерації"/>
     <w:qFormat/>
     <w:rPr/>
   </w:style>
@@ -1924,7 +3379,7 @@
       <w:u w:val="single"/>
     </w:rPr>
   </w:style>
-  <w:style w:type="paragraph" w:styleId="Style12">
+  <w:style w:type="paragraph" w:styleId="Style13">
     <w:name w:val="Заголовок"/>
     <w:basedOn w:val="Normal"/>
     <w:next w:val="BodyText"/>
@@ -1934,7 +3389,7 @@
       <w:spacing w:before="240" w:after="120"/>
     </w:pPr>
     <w:rPr>
-      <w:rFonts w:ascii="Liberation Sans" w:hAnsi="Liberation Sans" w:eastAsia="Microsoft YaHei" w:cs="Arial Unicode MS"/>
+      <w:rFonts w:ascii="Liberation Sans" w:hAnsi="Liberation Sans" w:eastAsia="Microsoft YaHei" w:cs="Lucida Sans"/>
       <w:sz w:val="28"/>
       <w:szCs w:val="28"/>
     </w:rPr>
@@ -1971,8 +3426,34 @@
       <w:szCs w:val="24"/>
     </w:rPr>
   </w:style>
-  <w:style w:type="paragraph" w:styleId="Style13">
+  <w:style w:type="paragraph" w:styleId="Style14">
     <w:name w:val="Покажчик"/>
+    <w:basedOn w:val="Normal"/>
+    <w:qFormat/>
+    <w:pPr>
+      <w:suppressLineNumbers/>
+    </w:pPr>
+    <w:rPr>
+      <w:rFonts w:cs="Lucida Sans"/>
+    </w:rPr>
+  </w:style>
+  <w:style w:type="paragraph" w:styleId="user">
+    <w:name w:val="Заголовок (user)"/>
+    <w:basedOn w:val="Normal"/>
+    <w:next w:val="BodyText"/>
+    <w:qFormat/>
+    <w:pPr>
+      <w:keepNext w:val="true"/>
+      <w:spacing w:before="240" w:after="120"/>
+    </w:pPr>
+    <w:rPr>
+      <w:rFonts w:ascii="Liberation Sans" w:hAnsi="Liberation Sans" w:eastAsia="Microsoft YaHei" w:cs="Arial Unicode MS"/>
+      <w:sz w:val="28"/>
+      <w:szCs w:val="28"/>
+    </w:rPr>
+  </w:style>
+  <w:style w:type="paragraph" w:styleId="user1">
+    <w:name w:val="Покажчик (user)"/>
     <w:basedOn w:val="Normal"/>
     <w:qFormat/>
     <w:pPr>
@@ -1982,35 +3463,9 @@
       <w:rFonts w:cs="Arial Unicode MS"/>
     </w:rPr>
   </w:style>
-  <w:style w:type="paragraph" w:styleId="user1">
-    <w:name w:val="Заголовок (user)"/>
-    <w:basedOn w:val="Normal"/>
-    <w:next w:val="BodyText"/>
-    <w:qFormat/>
-    <w:pPr>
-      <w:keepNext w:val="true"/>
-      <w:spacing w:before="240" w:after="120"/>
-    </w:pPr>
-    <w:rPr>
-      <w:rFonts w:ascii="Liberation Sans" w:hAnsi="Liberation Sans" w:eastAsia="Microsoft YaHei" w:cs="Lucida Sans"/>
-      <w:sz w:val="28"/>
-      <w:szCs w:val="28"/>
-    </w:rPr>
-  </w:style>
-  <w:style w:type="paragraph" w:styleId="user2">
-    <w:name w:val="Покажчик (user)"/>
-    <w:basedOn w:val="Normal"/>
-    <w:qFormat/>
-    <w:pPr>
-      <w:suppressLineNumbers/>
-    </w:pPr>
-    <w:rPr>
-      <w:rFonts w:cs="Lucida Sans"/>
-    </w:rPr>
-  </w:style>
   <w:style w:type="paragraph" w:styleId="IndexHeading">
     <w:name w:val="index heading"/>
-    <w:basedOn w:val="Style12"/>
+    <w:basedOn w:val="user"/>
     <w:pPr/>
     <w:rPr/>
   </w:style>
@@ -2285,8 +3740,8 @@
     </w:pPr>
     <w:rPr/>
   </w:style>
-  <w:style w:type="numbering" w:styleId="Style14" w:default="1">
-    <w:name w:val="Без маркерів"/>
+  <w:style w:type="numbering" w:styleId="user2" w:default="1">
+    <w:name w:val="Без маркерів (user)"/>
     <w:uiPriority w:val="99"/>
     <w:semiHidden/>
     <w:unhideWhenUsed/>

</xml_diff>

<commit_message>
feat: filling in the report
</commit_message>
<xml_diff>
--- a/51IP Injenerija prykladnyh zastosunkiv/1/IP_KNT-122_Onyshchenko_19_PR1.docx
+++ b/51IP Injenerija prykladnyh zastosunkiv/1/IP_KNT-122_Onyshchenko_19_PR1.docx
@@ -392,13 +392,11 @@
           <w:tab w:val="center" w:pos="4961" w:leader="none"/>
         </w:tabs>
         <w:ind w:hanging="0"/>
-        <w:rPr/>
-      </w:pPr>
-      <w:r>
-        <w:rPr/>
-      </w:r>
-      <w:r>
-        <w:br w:type="page"/>
+        <w:jc w:val="center"/>
+        <w:rPr/>
+      </w:pPr>
+      <w:r>
+        <w:rPr/>
       </w:r>
     </w:p>
     <w:p>
@@ -2235,6 +2233,453 @@
     </w:p>
     <w:p>
       <w:pPr>
+        <w:pStyle w:val="p11"/>
+        <w:rPr>
+          <w:lang w:val="uk-UA"/>
+        </w:rPr>
+      </w:pPr>
+      <w:r>
+        <w:rPr>
+          <w:lang w:val="uk-UA"/>
+        </w:rPr>
+        <w:t>Також під час роботи програма видає наступні рядки у консоль:</w:t>
+      </w:r>
+    </w:p>
+    <w:p>
+      <w:pPr>
+        <w:pStyle w:val="p11"/>
+        <w:rPr>
+          <w:lang w:val="uk-UA"/>
+        </w:rPr>
+      </w:pPr>
+      <w:r>
+        <w:rPr>
+          <w:lang w:val="uk-UA"/>
+        </w:rPr>
+      </w:r>
+    </w:p>
+    <w:p>
+      <w:pPr>
+        <w:pStyle w:val="Code"/>
+        <w:rPr/>
+      </w:pPr>
+      <w:r>
+        <w:rPr/>
+        <w:t>Performing stepwise search to minimize aic</w:t>
+      </w:r>
+    </w:p>
+    <w:p>
+      <w:pPr>
+        <w:pStyle w:val="Code"/>
+        <w:rPr/>
+      </w:pPr>
+      <w:r>
+        <w:rPr/>
+        <w:t xml:space="preserve"> </w:t>
+      </w:r>
+      <w:r>
+        <w:rPr/>
+        <w:t>ARIMA(2,1,2)(0,0,0)[0] intercept   : AIC=inf, Time=0.41 sec</w:t>
+      </w:r>
+    </w:p>
+    <w:p>
+      <w:pPr>
+        <w:pStyle w:val="Code"/>
+        <w:rPr/>
+      </w:pPr>
+      <w:r>
+        <w:rPr/>
+        <w:t xml:space="preserve"> </w:t>
+      </w:r>
+      <w:r>
+        <w:rPr/>
+        <w:t>ARIMA(0,1,0)(0,0,0)[0] intercept   : AIC=2657.357, Time=0.03 sec</w:t>
+      </w:r>
+    </w:p>
+    <w:p>
+      <w:pPr>
+        <w:pStyle w:val="Code"/>
+        <w:rPr/>
+      </w:pPr>
+      <w:r>
+        <w:rPr/>
+        <w:t xml:space="preserve"> </w:t>
+      </w:r>
+      <w:r>
+        <w:rPr/>
+        <w:t>ARIMA(1,1,0)(0,0,0)[0] intercept   : AIC=2599.753, Time=0.06 sec</w:t>
+      </w:r>
+    </w:p>
+    <w:p>
+      <w:pPr>
+        <w:pStyle w:val="Code"/>
+        <w:rPr/>
+      </w:pPr>
+      <w:r>
+        <w:rPr/>
+        <w:t xml:space="preserve"> </w:t>
+      </w:r>
+      <w:r>
+        <w:rPr/>
+        <w:t>ARIMA(0,1,1)(0,0,0)[0] intercept   : AIC=2531.251, Time=0.07 sec</w:t>
+      </w:r>
+    </w:p>
+    <w:p>
+      <w:pPr>
+        <w:pStyle w:val="Code"/>
+        <w:rPr/>
+      </w:pPr>
+      <w:r>
+        <w:rPr/>
+        <w:t xml:space="preserve"> </w:t>
+      </w:r>
+      <w:r>
+        <w:rPr/>
+        <w:t>ARIMA(0,1,0)(0,0,0)[0]             : AIC=2655.436, Time=0.03 sec</w:t>
+      </w:r>
+    </w:p>
+    <w:p>
+      <w:pPr>
+        <w:pStyle w:val="Code"/>
+        <w:rPr/>
+      </w:pPr>
+      <w:r>
+        <w:rPr/>
+        <w:t xml:space="preserve"> </w:t>
+      </w:r>
+      <w:r>
+        <w:rPr/>
+        <w:t>ARIMA(1,1,1)(0,0,0)[0] intercept   : AIC=2531.973, Time=0.09 sec</w:t>
+      </w:r>
+    </w:p>
+    <w:p>
+      <w:pPr>
+        <w:pStyle w:val="Code"/>
+        <w:rPr/>
+      </w:pPr>
+      <w:r>
+        <w:rPr/>
+        <w:t xml:space="preserve"> </w:t>
+      </w:r>
+      <w:r>
+        <w:rPr/>
+        <w:t>ARIMA(0,1,2)(0,0,0)[0] intercept   : AIC=2433.235, Time=0.14 sec</w:t>
+      </w:r>
+    </w:p>
+    <w:p>
+      <w:pPr>
+        <w:pStyle w:val="Code"/>
+        <w:rPr/>
+      </w:pPr>
+      <w:r>
+        <w:rPr/>
+        <w:t xml:space="preserve"> </w:t>
+      </w:r>
+      <w:r>
+        <w:rPr/>
+        <w:t>ARIMA(1,1,2)(0,0,0)[0] intercept   : AIC=2400.984, Time=0.17 sec</w:t>
+      </w:r>
+    </w:p>
+    <w:p>
+      <w:pPr>
+        <w:pStyle w:val="Code"/>
+        <w:rPr/>
+      </w:pPr>
+      <w:r>
+        <w:rPr/>
+        <w:t xml:space="preserve"> </w:t>
+      </w:r>
+      <w:r>
+        <w:rPr/>
+        <w:t>ARIMA(1,1,3)(0,0,0)[0] intercept   : AIC=2353.950, Time=0.20 sec</w:t>
+      </w:r>
+    </w:p>
+    <w:p>
+      <w:pPr>
+        <w:pStyle w:val="Code"/>
+        <w:rPr/>
+      </w:pPr>
+      <w:r>
+        <w:rPr/>
+        <w:t xml:space="preserve"> </w:t>
+      </w:r>
+      <w:r>
+        <w:rPr/>
+        <w:t>ARIMA(0,1,3)(0,0,0)[0] intercept   : AIC=2353.710, Time=0.18 sec</w:t>
+      </w:r>
+    </w:p>
+    <w:p>
+      <w:pPr>
+        <w:pStyle w:val="Code"/>
+        <w:rPr/>
+      </w:pPr>
+      <w:r>
+        <w:rPr/>
+        <w:t xml:space="preserve"> </w:t>
+      </w:r>
+      <w:r>
+        <w:rPr/>
+        <w:t>ARIMA(0,1,4)(0,0,0)[0] intercept   : AIC=2336.712, Time=0.20 sec</w:t>
+      </w:r>
+    </w:p>
+    <w:p>
+      <w:pPr>
+        <w:pStyle w:val="Code"/>
+        <w:rPr/>
+      </w:pPr>
+      <w:r>
+        <w:rPr/>
+        <w:t xml:space="preserve"> </w:t>
+      </w:r>
+      <w:r>
+        <w:rPr/>
+        <w:t>ARIMA(1,1,4)(0,0,0)[0] intercept   : AIC=2337.090, Time=0.35 sec</w:t>
+      </w:r>
+    </w:p>
+    <w:p>
+      <w:pPr>
+        <w:pStyle w:val="Code"/>
+        <w:rPr/>
+      </w:pPr>
+      <w:r>
+        <w:rPr/>
+        <w:t xml:space="preserve"> </w:t>
+      </w:r>
+      <w:r>
+        <w:rPr/>
+        <w:t>ARIMA(0,1,5)(0,0,0)[0] intercept   : AIC=2263.899, Time=0.31 sec</w:t>
+      </w:r>
+    </w:p>
+    <w:p>
+      <w:pPr>
+        <w:pStyle w:val="Code"/>
+        <w:rPr/>
+      </w:pPr>
+      <w:r>
+        <w:rPr/>
+        <w:t xml:space="preserve"> </w:t>
+      </w:r>
+      <w:r>
+        <w:rPr/>
+        <w:t>ARIMA(1,1,5)(0,0,0)[0] intercept   : AIC=2253.412, Time=0.43 sec</w:t>
+      </w:r>
+    </w:p>
+    <w:p>
+      <w:pPr>
+        <w:pStyle w:val="Code"/>
+        <w:rPr/>
+      </w:pPr>
+      <w:r>
+        <w:rPr/>
+        <w:t xml:space="preserve"> </w:t>
+      </w:r>
+      <w:r>
+        <w:rPr/>
+        <w:t>ARIMA(2,1,5)(0,0,0)[0] intercept   : AIC=1976.267, Time=0.75 sec</w:t>
+      </w:r>
+    </w:p>
+    <w:p>
+      <w:pPr>
+        <w:pStyle w:val="Code"/>
+        <w:rPr/>
+      </w:pPr>
+      <w:r>
+        <w:rPr/>
+        <w:t xml:space="preserve"> </w:t>
+      </w:r>
+      <w:r>
+        <w:rPr/>
+        <w:t>ARIMA(2,1,4)(0,0,0)[0] intercept   : AIC=1971.845, Time=0.56 sec</w:t>
+      </w:r>
+    </w:p>
+    <w:p>
+      <w:pPr>
+        <w:pStyle w:val="Code"/>
+        <w:rPr/>
+      </w:pPr>
+      <w:r>
+        <w:rPr/>
+        <w:t xml:space="preserve"> </w:t>
+      </w:r>
+      <w:r>
+        <w:rPr/>
+        <w:t>ARIMA(2,1,3)(0,0,0)[0] intercept   : AIC=2007.706, Time=0.53 sec</w:t>
+      </w:r>
+    </w:p>
+    <w:p>
+      <w:pPr>
+        <w:pStyle w:val="Code"/>
+        <w:rPr/>
+      </w:pPr>
+      <w:r>
+        <w:rPr/>
+        <w:t xml:space="preserve"> </w:t>
+      </w:r>
+      <w:r>
+        <w:rPr/>
+        <w:t>ARIMA(3,1,4)(0,0,0)[0] intercept   : AIC=1984.166, Time=0.71 sec</w:t>
+      </w:r>
+    </w:p>
+    <w:p>
+      <w:pPr>
+        <w:pStyle w:val="Code"/>
+        <w:rPr/>
+      </w:pPr>
+      <w:r>
+        <w:rPr/>
+        <w:t xml:space="preserve"> </w:t>
+      </w:r>
+      <w:r>
+        <w:rPr/>
+        <w:t>ARIMA(3,1,3)(0,0,0)[0] intercept   : AIC=inf, Time=0.54 sec</w:t>
+      </w:r>
+    </w:p>
+    <w:p>
+      <w:pPr>
+        <w:pStyle w:val="Code"/>
+        <w:rPr/>
+      </w:pPr>
+      <w:r>
+        <w:rPr/>
+        <w:t xml:space="preserve"> </w:t>
+      </w:r>
+      <w:r>
+        <w:rPr/>
+        <w:t>ARIMA(3,1,5)(0,0,0)[0] intercept   : AIC=1971.153, Time=0.83 sec</w:t>
+      </w:r>
+    </w:p>
+    <w:p>
+      <w:pPr>
+        <w:pStyle w:val="Code"/>
+        <w:rPr/>
+      </w:pPr>
+      <w:r>
+        <w:rPr/>
+        <w:t xml:space="preserve"> </w:t>
+      </w:r>
+      <w:r>
+        <w:rPr/>
+        <w:t>ARIMA(4,1,5)(0,0,0)[0] intercept   : AIC=1968.056, Time=0.86 sec</w:t>
+      </w:r>
+    </w:p>
+    <w:p>
+      <w:pPr>
+        <w:pStyle w:val="Code"/>
+        <w:rPr/>
+      </w:pPr>
+      <w:r>
+        <w:rPr/>
+        <w:t xml:space="preserve"> </w:t>
+      </w:r>
+      <w:r>
+        <w:rPr/>
+        <w:t>ARIMA(4,1,4)(0,0,0)[0] intercept   : AIC=1963.244, Time=0.74 sec</w:t>
+      </w:r>
+    </w:p>
+    <w:p>
+      <w:pPr>
+        <w:pStyle w:val="Code"/>
+        <w:rPr/>
+      </w:pPr>
+      <w:r>
+        <w:rPr/>
+        <w:t xml:space="preserve"> </w:t>
+      </w:r>
+      <w:r>
+        <w:rPr/>
+        <w:t>ARIMA(4,1,3)(0,0,0)[0] intercept   : AIC=inf, Time=0.60 sec</w:t>
+      </w:r>
+    </w:p>
+    <w:p>
+      <w:pPr>
+        <w:pStyle w:val="Code"/>
+        <w:rPr/>
+      </w:pPr>
+      <w:r>
+        <w:rPr/>
+        <w:t xml:space="preserve"> </w:t>
+      </w:r>
+      <w:r>
+        <w:rPr/>
+        <w:t>ARIMA(5,1,4)(0,0,0)[0] intercept   : AIC=inf, Time=0.77 sec</w:t>
+      </w:r>
+    </w:p>
+    <w:p>
+      <w:pPr>
+        <w:pStyle w:val="Code"/>
+        <w:rPr/>
+      </w:pPr>
+      <w:r>
+        <w:rPr/>
+        <w:t xml:space="preserve"> </w:t>
+      </w:r>
+      <w:r>
+        <w:rPr/>
+        <w:t>ARIMA(5,1,3)(0,0,0)[0] intercept   : AIC=inf, Time=0.71 sec</w:t>
+      </w:r>
+    </w:p>
+    <w:p>
+      <w:pPr>
+        <w:pStyle w:val="Code"/>
+        <w:rPr/>
+      </w:pPr>
+      <w:r>
+        <w:rPr/>
+        <w:t xml:space="preserve"> </w:t>
+      </w:r>
+      <w:r>
+        <w:rPr/>
+        <w:t>ARIMA(5,1,5)(0,0,0)[0] intercept   : AIC=inf, Time=0.97 sec</w:t>
+      </w:r>
+    </w:p>
+    <w:p>
+      <w:pPr>
+        <w:pStyle w:val="Code"/>
+        <w:rPr/>
+      </w:pPr>
+      <w:r>
+        <w:rPr/>
+        <w:t xml:space="preserve"> </w:t>
+      </w:r>
+      <w:r>
+        <w:rPr/>
+        <w:t>ARIMA(4,1,4)(0,0,0)[0]             : AIC=1973.944, Time=0.58 sec</w:t>
+      </w:r>
+    </w:p>
+    <w:p>
+      <w:pPr>
+        <w:pStyle w:val="Code"/>
+        <w:rPr/>
+      </w:pPr>
+      <w:r>
+        <w:rPr/>
+      </w:r>
+    </w:p>
+    <w:p>
+      <w:pPr>
+        <w:pStyle w:val="Code"/>
+        <w:rPr/>
+      </w:pPr>
+      <w:r>
+        <w:rPr/>
+        <w:t>Best model:  ARIMA(4,1,4)(0,0,0)[0] intercept</w:t>
+      </w:r>
+    </w:p>
+    <w:p>
+      <w:pPr>
+        <w:pStyle w:val="p11"/>
+        <w:rPr>
+          <w:lang w:val="uk-UA"/>
+        </w:rPr>
+      </w:pPr>
+      <w:r>
+        <w:rPr>
+          <w:lang w:val="uk-UA"/>
+        </w:rPr>
+      </w:r>
+    </w:p>
+    <w:p>
+      <w:pPr>
         <w:pStyle w:val="h11"/>
         <w:rPr/>
       </w:pPr>
@@ -2269,87 +2714,378 @@
       </w:pPr>
       <w:r>
         <w:rPr/>
-      </w:r>
-    </w:p>
-    <w:p>
-      <w:pPr>
-        <w:pStyle w:val="p11"/>
-        <w:rPr/>
-      </w:pPr>
-      <w:r>
-        <w:rPr/>
-        <w:t>Що означають дані в таблиці.</w:t>
-      </w:r>
-    </w:p>
-    <w:p>
-      <w:pPr>
-        <w:pStyle w:val="p11"/>
-        <w:rPr/>
-      </w:pPr>
-      <w:r>
-        <w:rPr/>
+        <w:t>Під час виконання роботи виникли такі питання:</w:t>
+      </w:r>
+    </w:p>
+    <w:p>
+      <w:pPr>
+        <w:pStyle w:val="p11"/>
+        <w:rPr/>
+      </w:pPr>
+      <w:r>
+        <w:rPr/>
+      </w:r>
+    </w:p>
+    <w:p>
+      <w:pPr>
+        <w:pStyle w:val="H2"/>
+        <w:rPr>
+          <w:b w:val="false"/>
+          <w:bCs w:val="false"/>
+          <w:i/>
+          <w:iCs/>
+        </w:rPr>
+      </w:pPr>
+      <w:r>
+        <w:rPr>
+          <w:b w:val="false"/>
+          <w:bCs w:val="false"/>
+          <w:i/>
+          <w:iCs/>
+        </w:rPr>
+        <w:t>Що означають дані в таблиці?</w:t>
+      </w:r>
+    </w:p>
+    <w:p>
+      <w:pPr>
+        <w:pStyle w:val="H2"/>
+        <w:rPr>
+          <w:b w:val="false"/>
+          <w:bCs w:val="false"/>
+          <w:i/>
+          <w:iCs/>
+        </w:rPr>
+      </w:pPr>
+      <w:r>
+        <w:rPr>
+          <w:b w:val="false"/>
+          <w:bCs w:val="false"/>
+          <w:i/>
+          <w:iCs/>
+        </w:rPr>
         <w:t xml:space="preserve">В чому суть роботи </w:t>
       </w:r>
       <w:r>
         <w:rPr>
+          <w:b w:val="false"/>
+          <w:bCs w:val="false"/>
+          <w:i/>
+          <w:iCs/>
           <w:lang w:val="en-US"/>
         </w:rPr>
         <w:t xml:space="preserve">ARIMA (SARIMAX, </w:t>
       </w:r>
       <w:r>
         <w:rPr>
+          <w:b w:val="false"/>
+          <w:bCs w:val="false"/>
+          <w:i/>
+          <w:iCs/>
           <w:lang w:val="uk-UA"/>
         </w:rPr>
         <w:t>як в програмі</w:t>
       </w:r>
       <w:r>
         <w:rPr>
+          <w:b w:val="false"/>
+          <w:bCs w:val="false"/>
+          <w:i/>
+          <w:iCs/>
           <w:lang w:val="en-US"/>
         </w:rPr>
-        <w:t>).</w:t>
-      </w:r>
-    </w:p>
-    <w:p>
-      <w:pPr>
-        <w:pStyle w:val="p11"/>
-        <w:rPr>
+        <w:t>)?</w:t>
+      </w:r>
+    </w:p>
+    <w:p>
+      <w:pPr>
+        <w:pStyle w:val="H2"/>
+        <w:rPr>
+          <w:b w:val="false"/>
+          <w:bCs w:val="false"/>
+          <w:i/>
+          <w:iCs/>
+        </w:rPr>
+      </w:pPr>
+      <w:r>
+        <w:rPr>
+          <w:b w:val="false"/>
+          <w:bCs w:val="false"/>
+          <w:i/>
+          <w:iCs/>
+        </w:rPr>
+        <w:t xml:space="preserve">В чому суть роботи </w:t>
+      </w:r>
+      <w:r>
+        <w:rPr>
+          <w:b w:val="false"/>
+          <w:bCs w:val="false"/>
+          <w:i/>
+          <w:iCs/>
+          <w:lang w:val="en-US"/>
+        </w:rPr>
+        <w:t>ETS?</w:t>
+      </w:r>
+    </w:p>
+    <w:p>
+      <w:pPr>
+        <w:pStyle w:val="H2"/>
+        <w:rPr>
+          <w:b w:val="false"/>
+          <w:bCs w:val="false"/>
+          <w:i/>
+          <w:iCs/>
+        </w:rPr>
+      </w:pPr>
+      <w:r>
+        <w:rPr>
+          <w:b w:val="false"/>
+          <w:bCs w:val="false"/>
+          <w:i/>
+          <w:iCs/>
+        </w:rPr>
+        <w:t>Чим вони відрізняються?</w:t>
+      </w:r>
+    </w:p>
+    <w:p>
+      <w:pPr>
+        <w:pStyle w:val="H2"/>
+        <w:rPr>
+          <w:b w:val="false"/>
+          <w:bCs w:val="false"/>
+          <w:i/>
+          <w:iCs/>
+        </w:rPr>
+      </w:pPr>
+      <w:r>
+        <w:rPr>
+          <w:b w:val="false"/>
+          <w:bCs w:val="false"/>
+          <w:i/>
+          <w:iCs/>
+        </w:rPr>
+        <w:t xml:space="preserve">Що означають рядки, що починаються з </w:t>
+      </w:r>
+      <w:r>
+        <w:rPr>
+          <w:b w:val="false"/>
+          <w:bCs w:val="false"/>
+          <w:i/>
+          <w:iCs/>
+          <w:lang w:val="en-US"/>
+        </w:rPr>
+        <w:t>ARIMA?</w:t>
+      </w:r>
+    </w:p>
+    <w:p>
+      <w:pPr>
+        <w:pStyle w:val="P1"/>
+        <w:rPr>
+          <w:b w:val="false"/>
+          <w:bCs w:val="false"/>
+          <w:i/>
+          <w:iCs/>
+          <w:lang w:val="en-US"/>
+        </w:rPr>
+      </w:pPr>
+      <w:r>
+        <w:rPr>
+          <w:b w:val="false"/>
+          <w:bCs w:val="false"/>
+          <w:i/>
+          <w:iCs/>
+          <w:lang w:val="en-US"/>
+        </w:rPr>
+      </w:r>
+    </w:p>
+    <w:p>
+      <w:pPr>
+        <w:pStyle w:val="P1"/>
+        <w:rPr>
+          <w:b w:val="false"/>
+          <w:bCs w:val="false"/>
+          <w:i w:val="false"/>
+          <w:iCs w:val="false"/>
           <w:lang w:val="uk-UA"/>
         </w:rPr>
       </w:pPr>
       <w:r>
         <w:rPr>
+          <w:b w:val="false"/>
+          <w:bCs w:val="false"/>
+          <w:i w:val="false"/>
+          <w:iCs w:val="false"/>
           <w:lang w:val="uk-UA"/>
         </w:rPr>
-        <w:t xml:space="preserve">В чому суть роботи </w:t>
-      </w:r>
-      <w:r>
-        <w:rPr>
+        <w:t>Кожен з них є кроком з метою мінімізувати показник АІС.</w:t>
+      </w:r>
+    </w:p>
+    <w:p>
+      <w:pPr>
+        <w:pStyle w:val="P1"/>
+        <w:rPr>
+          <w:b w:val="false"/>
+          <w:bCs w:val="false"/>
+          <w:i w:val="false"/>
+          <w:iCs w:val="false"/>
+          <w:lang w:val="uk-UA"/>
+        </w:rPr>
+      </w:pPr>
+      <w:r>
+        <w:rPr>
+          <w:b w:val="false"/>
+          <w:bCs w:val="false"/>
+          <w:i w:val="false"/>
+          <w:iCs w:val="false"/>
+          <w:lang w:val="uk-UA"/>
+        </w:rPr>
+      </w:r>
+    </w:p>
+    <w:p>
+      <w:pPr>
+        <w:pStyle w:val="H2"/>
+        <w:rPr>
+          <w:b w:val="false"/>
+          <w:bCs w:val="false"/>
+          <w:i/>
+          <w:iCs/>
+        </w:rPr>
+      </w:pPr>
+      <w:r>
+        <w:rPr>
+          <w:b w:val="false"/>
+          <w:bCs w:val="false"/>
+          <w:i/>
+          <w:iCs/>
+        </w:rPr>
+        <w:t xml:space="preserve">Що таке </w:t>
+      </w:r>
+      <w:r>
+        <w:rPr>
+          <w:b w:val="false"/>
+          <w:bCs w:val="false"/>
+          <w:i/>
+          <w:iCs/>
           <w:lang w:val="en-US"/>
         </w:rPr>
-        <w:t>ETS.</w:t>
-      </w:r>
-    </w:p>
-    <w:p>
-      <w:pPr>
-        <w:pStyle w:val="p11"/>
-        <w:rPr>
+        <w:t>AIC</w:t>
+      </w:r>
+      <w:r>
+        <w:rPr>
+          <w:b w:val="false"/>
+          <w:bCs w:val="false"/>
+          <w:i/>
+          <w:iCs/>
+        </w:rPr>
+        <w:t>?</w:t>
+      </w:r>
+    </w:p>
+    <w:p>
+      <w:pPr>
+        <w:pStyle w:val="P1"/>
+        <w:rPr>
+          <w:b w:val="false"/>
+          <w:bCs w:val="false"/>
+          <w:i/>
+          <w:iCs/>
+        </w:rPr>
+      </w:pPr>
+      <w:r>
+        <w:rPr>
+          <w:b w:val="false"/>
+          <w:bCs w:val="false"/>
+          <w:i/>
+          <w:iCs/>
+        </w:rPr>
+      </w:r>
+    </w:p>
+    <w:p>
+      <w:pPr>
+        <w:pStyle w:val="P1"/>
+        <w:rPr>
+          <w:b w:val="false"/>
+          <w:bCs w:val="false"/>
+          <w:i w:val="false"/>
+          <w:iCs w:val="false"/>
+          <w:lang w:val="en-US"/>
+        </w:rPr>
+      </w:pPr>
+      <w:r>
+        <w:rPr>
+          <w:b w:val="false"/>
+          <w:bCs w:val="false"/>
+          <w:i w:val="false"/>
+          <w:iCs w:val="false"/>
+          <w:lang w:val="en-US"/>
+        </w:rPr>
+        <w:t xml:space="preserve">AIC (Akaike information criterion, </w:t>
+      </w:r>
+      <w:r>
+        <w:rPr>
+          <w:b w:val="false"/>
+          <w:bCs w:val="false"/>
+          <w:i w:val="false"/>
+          <w:iCs w:val="false"/>
           <w:lang w:val="uk-UA"/>
         </w:rPr>
-      </w:pPr>
-      <w:r>
-        <w:rPr>
-          <w:lang w:val="uk-UA"/>
-        </w:rPr>
-        <w:t>Чим вони відрізняються.</w:t>
-      </w:r>
-    </w:p>
-    <w:p>
-      <w:pPr>
-        <w:pStyle w:val="p11"/>
-        <w:rPr/>
-      </w:pPr>
-      <w:r>
-        <w:rPr/>
+        <w:t>Інформаційний критерій Акаіке) є оцінювачем похибки передбачувача.</w:t>
+      </w:r>
+    </w:p>
+    <w:p>
+      <w:pPr>
+        <w:pStyle w:val="P1"/>
+        <w:rPr>
+          <w:b w:val="false"/>
+          <w:bCs w:val="false"/>
+          <w:i/>
+          <w:iCs/>
+        </w:rPr>
+      </w:pPr>
+      <w:r>
+        <w:rPr>
+          <w:b w:val="false"/>
+          <w:bCs w:val="false"/>
+          <w:i/>
+          <w:iCs/>
+        </w:rPr>
+      </w:r>
+    </w:p>
+    <w:p>
+      <w:pPr>
+        <w:pStyle w:val="H2"/>
+        <w:rPr>
+          <w:b w:val="false"/>
+          <w:bCs w:val="false"/>
+          <w:i/>
+          <w:iCs/>
+        </w:rPr>
+      </w:pPr>
+      <w:r>
+        <w:rPr>
+          <w:b w:val="false"/>
+          <w:bCs w:val="false"/>
+          <w:i/>
+          <w:iCs/>
+        </w:rPr>
+        <w:t>Чому на графіках результатів частина з правильними результатами зміщена вниз?</w:t>
+      </w:r>
+    </w:p>
+    <w:p>
+      <w:pPr>
+        <w:pStyle w:val="p11"/>
+        <w:rPr/>
+      </w:pPr>
+      <w:r>
+        <w:rPr/>
+      </w:r>
+    </w:p>
+    <w:p>
+      <w:pPr>
+        <w:pStyle w:val="p11"/>
+        <w:rPr/>
+      </w:pPr>
+      <w:r>
+        <w:rPr/>
+        <w:t>Не зрозуміло.</w:t>
       </w:r>
     </w:p>
     <w:p>
@@ -3720,6 +4456,7 @@
       <w:spacing w:lineRule="auto" w:line="360" w:before="0" w:after="0"/>
       <w:ind w:hanging="0"/>
       <w:jc w:val="center"/>
+      <w:outlineLvl w:val="0"/>
     </w:pPr>
     <w:rPr>
       <w:rFonts w:ascii="Times New Roman" w:hAnsi="Times New Roman"/>
@@ -3737,6 +4474,28 @@
     <w:pPr>
       <w:ind w:hanging="0"/>
       <w:jc w:val="center"/>
+    </w:pPr>
+    <w:rPr/>
+  </w:style>
+  <w:style w:type="paragraph" w:styleId="Style15">
+    <w:name w:val="Верхній і нижній колонтитули"/>
+    <w:basedOn w:val="Normal"/>
+    <w:qFormat/>
+    <w:pPr>
+      <w:suppressLineNumbers/>
+      <w:tabs>
+        <w:tab w:val="clear" w:pos="851"/>
+        <w:tab w:val="center" w:pos="4513" w:leader="none"/>
+        <w:tab w:val="right" w:pos="9026" w:leader="none"/>
+      </w:tabs>
+    </w:pPr>
+    <w:rPr/>
+  </w:style>
+  <w:style w:type="paragraph" w:styleId="Header">
+    <w:name w:val="header"/>
+    <w:basedOn w:val="Style15"/>
+    <w:pPr>
+      <w:suppressLineNumbers/>
     </w:pPr>
     <w:rPr/>
   </w:style>

</xml_diff>

<commit_message>
fix: the graph is no longer so edged
</commit_message>
<xml_diff>
--- a/51IP Injenerija prykladnyh zastosunkiv/1/IP_KNT-122_Onyshchenko_19_PR1.docx
+++ b/51IP Injenerija prykladnyh zastosunkiv/1/IP_KNT-122_Onyshchenko_19_PR1.docx
@@ -120,7 +120,7 @@
       <w:pPr>
         <w:pStyle w:val="p11"/>
         <w:tabs>
-          <w:tab w:val="clear" w:pos="851"/>
+          <w:tab w:val="clear" w:pos="643"/>
           <w:tab w:val="left" w:pos="2185" w:leader="none"/>
           <w:tab w:val="center" w:pos="4535" w:leader="none"/>
         </w:tabs>
@@ -368,7 +368,7 @@
       <w:pPr>
         <w:pStyle w:val="p11"/>
         <w:tabs>
-          <w:tab w:val="clear" w:pos="851"/>
+          <w:tab w:val="clear" w:pos="643"/>
           <w:tab w:val="left" w:pos="1986" w:leader="none"/>
           <w:tab w:val="left" w:pos="4196" w:leader="none"/>
           <w:tab w:val="center" w:pos="4961" w:leader="none"/>
@@ -386,7 +386,7 @@
       <w:pPr>
         <w:pStyle w:val="p11"/>
         <w:tabs>
-          <w:tab w:val="clear" w:pos="851"/>
+          <w:tab w:val="clear" w:pos="643"/>
           <w:tab w:val="left" w:pos="1986" w:leader="none"/>
           <w:tab w:val="left" w:pos="4196" w:leader="none"/>
           <w:tab w:val="center" w:pos="4961" w:leader="none"/>
@@ -743,57 +743,13 @@
       </w:pPr>
       <w:r>
         <w:rPr/>
-        <w:t xml:space="preserve">Набір даних містить </w:t>
-      </w:r>
-      <w:r>
-        <w:rPr/>
-        <w:t>щомісячні</w:t>
-      </w:r>
-      <w:r>
-        <w:rPr/>
-        <w:t xml:space="preserve"> дані про споживання електроенергії. Місто, з якого взято ці дані, не вказане. Формат даних — C</w:t>
+        <w:t>Набір даних містить щомісячні дані про споживання електроенергії. Місто, з якого взято ці дані, не вказане. Формат даних — C</w:t>
       </w:r>
       <w:r>
         <w:rPr>
           <w:lang w:val="en-US"/>
         </w:rPr>
-        <w:t>SV (</w:t>
-      </w:r>
-      <w:r>
-        <w:rPr>
-          <w:lang w:val="en-US"/>
-        </w:rPr>
-        <w:t>C</w:t>
-      </w:r>
-      <w:r>
-        <w:rPr>
-          <w:lang w:val="en-US"/>
-        </w:rPr>
-        <w:t xml:space="preserve">omma </w:t>
-      </w:r>
-      <w:r>
-        <w:rPr>
-          <w:lang w:val="en-US"/>
-        </w:rPr>
-        <w:t>S</w:t>
-      </w:r>
-      <w:r>
-        <w:rPr>
-          <w:lang w:val="en-US"/>
-        </w:rPr>
-        <w:t xml:space="preserve">eparated </w:t>
-      </w:r>
-      <w:r>
-        <w:rPr>
-          <w:lang w:val="en-US"/>
-        </w:rPr>
-        <w:t>V</w:t>
-      </w:r>
-      <w:r>
-        <w:rPr>
-          <w:lang w:val="en-US"/>
-        </w:rPr>
-        <w:t>alues).</w:t>
+        <w:t>SV (Comma Separated Values).</w:t>
       </w:r>
     </w:p>
     <w:p>
@@ -996,11 +952,7 @@
       </w:pPr>
       <w:r>
         <w:rPr/>
-        <w:t xml:space="preserve"># </w:t>
-      </w:r>
-      <w:r>
-        <w:rPr/>
-        <w:t>Читати дані з файлу</w:t>
+        <w:t># Читати дані з файлу</w:t>
       </w:r>
     </w:p>
     <w:p>
@@ -1059,11 +1011,7 @@
       </w:pPr>
       <w:r>
         <w:rPr/>
-        <w:t xml:space="preserve"># </w:t>
-      </w:r>
-      <w:r>
-        <w:rPr/>
-        <w:t xml:space="preserve">Конвертувати стовпець з датою у формат дати </w:t>
+        <w:t xml:space="preserve"># Конвертувати стовпець з датою у формат дати </w:t>
       </w:r>
     </w:p>
     <w:p>
@@ -1122,11 +1070,7 @@
       </w:pPr>
       <w:r>
         <w:rPr/>
-        <w:t xml:space="preserve"># </w:t>
-      </w:r>
-      <w:r>
-        <w:rPr/>
-        <w:t>Графік первинних даних</w:t>
+        <w:t># Графік первинних даних</w:t>
       </w:r>
     </w:p>
     <w:p>
@@ -1235,11 +1179,7 @@
       </w:pPr>
       <w:r>
         <w:rPr/>
-        <w:t xml:space="preserve"># </w:t>
-      </w:r>
-      <w:r>
-        <w:rPr/>
-        <w:t>Декомпозиція даних на сезональні, періодичні, тощо.</w:t>
+        <w:t># Декомпозиція даних на сезональні, періодичні, тощо.</w:t>
       </w:r>
     </w:p>
     <w:p>
@@ -1288,11 +1228,7 @@
       </w:pPr>
       <w:r>
         <w:rPr/>
-        <w:t xml:space="preserve"># </w:t>
-      </w:r>
-      <w:r>
-        <w:rPr/>
-        <w:t>Розділення даних на тестові та навчальні</w:t>
+        <w:t># Розділення даних на тестові та навчальні</w:t>
       </w:r>
     </w:p>
     <w:p>
@@ -1331,15 +1267,7 @@
       </w:pPr>
       <w:r>
         <w:rPr/>
-        <w:t xml:space="preserve"># </w:t>
-      </w:r>
-      <w:r>
-        <w:rPr/>
-        <w:t xml:space="preserve">Застосувати модель </w:t>
-      </w:r>
-      <w:r>
-        <w:rPr/>
-        <w:t xml:space="preserve">ARIMA </w:t>
+        <w:t xml:space="preserve"># Застосувати модель ARIMA </w:t>
       </w:r>
     </w:p>
     <w:p>
@@ -1492,11 +1420,7 @@
       </w:pPr>
       <w:r>
         <w:rPr/>
-        <w:t xml:space="preserve"># </w:t>
-      </w:r>
-      <w:r>
-        <w:rPr/>
-        <w:t>Графік отриманих результатів</w:t>
+        <w:t># Графік отриманих результатів</w:t>
       </w:r>
     </w:p>
     <w:p>
@@ -1615,15 +1539,7 @@
       </w:pPr>
       <w:r>
         <w:rPr/>
-        <w:t xml:space="preserve"># </w:t>
-      </w:r>
-      <w:r>
-        <w:rPr/>
-        <w:t xml:space="preserve">Застосувати модель </w:t>
-      </w:r>
-      <w:r>
-        <w:rPr/>
-        <w:t>ETS</w:t>
+        <w:t># Застосувати модель ETS</w:t>
       </w:r>
     </w:p>
     <w:p>
@@ -1706,11 +1622,7 @@
       </w:pPr>
       <w:r>
         <w:rPr/>
-        <w:t xml:space="preserve"># </w:t>
-      </w:r>
-      <w:r>
-        <w:rPr/>
-        <w:t xml:space="preserve">Графік отриманих результатів </w:t>
+        <w:t xml:space="preserve"># Графік отриманих результатів </w:t>
       </w:r>
     </w:p>
     <w:p>
@@ -2010,7 +1922,7 @@
         <w:rPr/>
         <w:drawing>
           <wp:inline distT="0" distB="0" distL="0" distR="0">
-            <wp:extent cx="5731510" cy="2865755"/>
+            <wp:extent cx="5731510" cy="2990850"/>
             <wp:effectExtent l="0" t="0" r="0" b="0"/>
             <wp:docPr id="4" name="Зображення5"/>
             <wp:cNvGraphicFramePr>
@@ -2034,7 +1946,7 @@
                   <pic:spPr bwMode="auto">
                     <a:xfrm>
                       <a:off x="0" y="0"/>
-                      <a:ext cx="5731510" cy="2865755"/>
+                      <a:ext cx="5731510" cy="2990850"/>
                     </a:xfrm>
                     <a:prstGeom prst="rect">
                       <a:avLst/>
@@ -3085,7 +2997,7 @@
       </w:pPr>
       <w:r>
         <w:rPr/>
-        <w:t>Не зрозуміло.</w:t>
+        <w:t>Було виправлено шляхом додавання більшого інтервалу при розбитті на тестову та навчальну вибірки.</w:t>
       </w:r>
     </w:p>
     <w:p>
@@ -4103,8 +4015,8 @@
       <w:lang w:val="en-US" w:eastAsia="uk-UA"/>
     </w:rPr>
   </w:style>
-  <w:style w:type="character" w:styleId="Style12">
-    <w:name w:val="Символ нумерації"/>
+  <w:style w:type="character" w:styleId="user">
+    <w:name w:val="Символ нумерації (user)"/>
     <w:qFormat/>
     <w:rPr/>
   </w:style>
@@ -4115,7 +4027,7 @@
       <w:u w:val="single"/>
     </w:rPr>
   </w:style>
-  <w:style w:type="paragraph" w:styleId="Style13">
+  <w:style w:type="paragraph" w:styleId="Style12">
     <w:name w:val="Заголовок"/>
     <w:basedOn w:val="Normal"/>
     <w:next w:val="BodyText"/>
@@ -4125,7 +4037,7 @@
       <w:spacing w:before="240" w:after="120"/>
     </w:pPr>
     <w:rPr>
-      <w:rFonts w:ascii="Liberation Sans" w:hAnsi="Liberation Sans" w:eastAsia="Microsoft YaHei" w:cs="Lucida Sans"/>
+      <w:rFonts w:ascii="Liberation Sans" w:hAnsi="Liberation Sans" w:eastAsia="Microsoft YaHei" w:cs="Arial Unicode MS"/>
       <w:sz w:val="28"/>
       <w:szCs w:val="28"/>
     </w:rPr>
@@ -4162,8 +4074,34 @@
       <w:szCs w:val="24"/>
     </w:rPr>
   </w:style>
-  <w:style w:type="paragraph" w:styleId="Style14">
+  <w:style w:type="paragraph" w:styleId="Style13">
     <w:name w:val="Покажчик"/>
+    <w:basedOn w:val="Normal"/>
+    <w:qFormat/>
+    <w:pPr>
+      <w:suppressLineNumbers/>
+    </w:pPr>
+    <w:rPr>
+      <w:rFonts w:cs="Arial Unicode MS"/>
+    </w:rPr>
+  </w:style>
+  <w:style w:type="paragraph" w:styleId="user1">
+    <w:name w:val="Заголовок (user)"/>
+    <w:basedOn w:val="Normal"/>
+    <w:next w:val="BodyText"/>
+    <w:qFormat/>
+    <w:pPr>
+      <w:keepNext w:val="true"/>
+      <w:spacing w:before="240" w:after="120"/>
+    </w:pPr>
+    <w:rPr>
+      <w:rFonts w:ascii="Liberation Sans" w:hAnsi="Liberation Sans" w:eastAsia="Microsoft YaHei" w:cs="Lucida Sans"/>
+      <w:sz w:val="28"/>
+      <w:szCs w:val="28"/>
+    </w:rPr>
+  </w:style>
+  <w:style w:type="paragraph" w:styleId="user2">
+    <w:name w:val="Покажчик (user)"/>
     <w:basedOn w:val="Normal"/>
     <w:qFormat/>
     <w:pPr>
@@ -4173,35 +4111,9 @@
       <w:rFonts w:cs="Lucida Sans"/>
     </w:rPr>
   </w:style>
-  <w:style w:type="paragraph" w:styleId="user">
-    <w:name w:val="Заголовок (user)"/>
-    <w:basedOn w:val="Normal"/>
-    <w:next w:val="BodyText"/>
-    <w:qFormat/>
-    <w:pPr>
-      <w:keepNext w:val="true"/>
-      <w:spacing w:before="240" w:after="120"/>
-    </w:pPr>
-    <w:rPr>
-      <w:rFonts w:ascii="Liberation Sans" w:hAnsi="Liberation Sans" w:eastAsia="Microsoft YaHei" w:cs="Arial Unicode MS"/>
-      <w:sz w:val="28"/>
-      <w:szCs w:val="28"/>
-    </w:rPr>
-  </w:style>
-  <w:style w:type="paragraph" w:styleId="user1">
-    <w:name w:val="Покажчик (user)"/>
-    <w:basedOn w:val="Normal"/>
-    <w:qFormat/>
-    <w:pPr>
-      <w:suppressLineNumbers/>
-    </w:pPr>
-    <w:rPr>
-      <w:rFonts w:cs="Arial Unicode MS"/>
-    </w:rPr>
-  </w:style>
   <w:style w:type="paragraph" w:styleId="IndexHeading">
     <w:name w:val="index heading"/>
-    <w:basedOn w:val="user"/>
+    <w:basedOn w:val="Style12"/>
     <w:pPr/>
     <w:rPr/>
   </w:style>
@@ -4359,7 +4271,7 @@
     <w:rsid w:val="00485ae4"/>
     <w:pPr>
       <w:tabs>
-        <w:tab w:val="clear" w:pos="851"/>
+        <w:tab w:val="clear" w:pos="643"/>
         <w:tab w:val="left" w:pos="916" w:leader="none"/>
         <w:tab w:val="left" w:pos="1832" w:leader="none"/>
         <w:tab w:val="left" w:pos="2748" w:leader="none"/>
@@ -4477,30 +4389,37 @@
     </w:pPr>
     <w:rPr/>
   </w:style>
-  <w:style w:type="paragraph" w:styleId="Style15">
-    <w:name w:val="Верхній і нижній колонтитули"/>
+  <w:style w:type="paragraph" w:styleId="user3">
+    <w:name w:val="Верхній і нижній колонтитули (user)"/>
     <w:basedOn w:val="Normal"/>
     <w:qFormat/>
     <w:pPr>
       <w:suppressLineNumbers/>
       <w:tabs>
-        <w:tab w:val="clear" w:pos="851"/>
+        <w:tab w:val="clear" w:pos="643"/>
         <w:tab w:val="center" w:pos="4513" w:leader="none"/>
         <w:tab w:val="right" w:pos="9026" w:leader="none"/>
       </w:tabs>
     </w:pPr>
     <w:rPr/>
   </w:style>
+  <w:style w:type="paragraph" w:styleId="Style14">
+    <w:name w:val="Верхній і нижній колонтитули"/>
+    <w:basedOn w:val="Normal"/>
+    <w:qFormat/>
+    <w:pPr/>
+    <w:rPr/>
+  </w:style>
   <w:style w:type="paragraph" w:styleId="Header">
     <w:name w:val="header"/>
-    <w:basedOn w:val="Style15"/>
+    <w:basedOn w:val="user3"/>
     <w:pPr>
       <w:suppressLineNumbers/>
     </w:pPr>
     <w:rPr/>
   </w:style>
-  <w:style w:type="numbering" w:styleId="user2" w:default="1">
-    <w:name w:val="Без маркерів (user)"/>
+  <w:style w:type="numbering" w:styleId="Style15" w:default="1">
+    <w:name w:val="Без маркерів"/>
     <w:uiPriority w:val="99"/>
     <w:semiHidden/>
     <w:unhideWhenUsed/>

</xml_diff>

<commit_message>
feat: IP1 done barely
</commit_message>
<xml_diff>
--- a/51IP Injenerija prykladnyh zastosunkiv/1/IP_KNT-122_Onyshchenko_19_PR1.docx
+++ b/51IP Injenerija prykladnyh zastosunkiv/1/IP_KNT-122_Onyshchenko_19_PR1.docx
@@ -1238,17 +1238,33 @@
       </w:pPr>
       <w:r>
         <w:rPr/>
-        <w:t>train = df[:-12]</w:t>
-      </w:r>
-    </w:p>
-    <w:p>
-      <w:pPr>
-        <w:pStyle w:val="Code"/>
-        <w:rPr/>
-      </w:pPr>
-      <w:r>
-        <w:rPr/>
-        <w:t>test = df[-12:]</w:t>
+        <w:t>train = df[:-</w:t>
+      </w:r>
+      <w:r>
+        <w:rPr/>
+        <w:t>24</w:t>
+      </w:r>
+      <w:r>
+        <w:rPr/>
+        <w:t>]</w:t>
+      </w:r>
+    </w:p>
+    <w:p>
+      <w:pPr>
+        <w:pStyle w:val="Code"/>
+        <w:rPr/>
+      </w:pPr>
+      <w:r>
+        <w:rPr/>
+        <w:t>test = df[-</w:t>
+      </w:r>
+      <w:r>
+        <w:rPr/>
+        <w:t>24</w:t>
+      </w:r>
+      <w:r>
+        <w:rPr/>
+        <w:t>:]</w:t>
       </w:r>
     </w:p>
     <w:p>
@@ -2998,6 +3014,15 @@
       <w:r>
         <w:rPr/>
         <w:t>Було виправлено шляхом додавання більшого інтервалу при розбитті на тестову та навчальну вибірки.</w:t>
+      </w:r>
+    </w:p>
+    <w:p>
+      <w:pPr>
+        <w:pStyle w:val="p11"/>
+        <w:rPr/>
+      </w:pPr>
+      <w:r>
+        <w:rPr/>
       </w:r>
     </w:p>
     <w:p>

</xml_diff>